<commit_message>
Documento de funcionamiento: seccion 9.7 con benchmark, walk-forward realista y detector por horizonte; curva50 no adoptada
Co-Authored-By: Claude Opus 5.5 <noreply@anthropic.com>
</commit_message>
<xml_diff>
--- a/docs/Funcionamiento_Augur.docx
+++ b/docs/Funcionamiento_Augur.docx
@@ -5778,7 +5778,33 @@
         <w:t>pico</w:t>
       </w:r>
       <w:r>
-        <w:t xml:space="preserve"> si queda en 1,3 veces o más. Usa las mismas variables públicas al corte, incluido el predespacho. Sus probabilidades se muestran en el dashboard como alerta; no modifican el pronóstico central.</w:t>
+        <w:t xml:space="preserve"> si queda en 1,3 veces o más. Usa las mismas variables públicas al corte, incluido el predespacho. Sus probabilidades se muestran en el dashboard como alerta (una posibilidad, no una certeza); no modifican el pronóstico central.</w:t>
+      </w:r>
+    </w:p>
+    <w:p>
+      <w:pPr>
+        <w:jc w:val="both"/>
+      </w:pPr>
+      <w:r>
+        <w:t xml:space="preserve">Para el segundo y el tercer día del horizonte de 72 h hay un detector por día de anticipación, con lo publicado al corte (el predespacho del día del corte, no el del día pronosticado). Se validó en los cinco años históricos y en 2026 frente a la climatología (sección 9.7): el de </w:t>
+      </w:r>
+      <w:r>
+        <w:rPr>
+          <w:b/>
+        </w:rPr>
+        <w:t>pico</w:t>
+      </w:r>
+      <w:r>
+        <w:t xml:space="preserve"> se publica, marcado como menos confiable que el del primer día; el de </w:t>
+      </w:r>
+      <w:r>
+        <w:rPr>
+          <w:b/>
+        </w:rPr>
+        <w:t>desplome</w:t>
+      </w:r>
+      <w:r>
+        <w:t xml:space="preserve"> no, porque no supera a la climatología de forma consistente.</w:t>
       </w:r>
     </w:p>
     <w:p>
@@ -5794,7 +5820,7 @@
         <w:jc w:val="both"/>
       </w:pPr>
       <w:r>
-        <w:t>El camino hasta el diseño final comparó persistencia, Prophet, XGBoost, ARX+GARCH, GARCH-ged (diseño LEAR), N-BEATSx y N-HiTS, y un ensamble de seis de ellos (el diseño del informe de avance). También se descartaron, por no mejorar o por usar información no disponible: XGBoost y LEAR sobre la razón con el predespacho, redes neuronales con predespacho, corrección de sesgo, ponderación por recencia, combinador por hora, las ofertas OFEI (fuga) y estirar la amplitud de los picos (DILATE). Las redes neuronales además resultaron muy sensibles a cambios pequeños en los datos.</w:t>
+        <w:t>El camino hasta el diseño final comparó persistencia, Prophet, XGBoost, ARX+GARCH, GARCH-ged (diseño LEAR), N-BEATSx y N-HiTS, y un ensamble de seis de ellos (el diseño del informe de avance). También se descartaron, por no mejorar o por usar información no disponible: XGBoost y LEAR sobre la razón con el predespacho, redes neuronales con predespacho, corrección de sesgo, ponderación por recencia, combinador por hora, las ofertas OFEI (fuga) y estirar la amplitud de los picos (DILATE). Las redes neuronales además resultaron muy sensibles a cambios pequeños en los datos. La sección 9.7 muestra la comparación completa, con validación en cinco años históricos, que justifica el diseño final.</w:t>
       </w:r>
     </w:p>
     <w:p>
@@ -10506,7 +10532,7 @@
         <w:jc w:val="both"/>
       </w:pPr>
       <w:r>
-        <w:t>El salto de septiembre coincide con la activación de la Resolución CREG 101 127 (9 de septiembre): el error del predespacho de XM se duplicó en las mismas fechas, lo que indica un cambio en cómo se forma el precio y no una falla del modelo. Se está probando un reentrenamiento que incorpora la curva de referencia de la resolución; solo pasará a producción si se valida en los años históricos.</w:t>
+        <w:t>El salto de septiembre coincide con la activación de la Resolución CREG 101 127 (9 de septiembre): el error del predespacho de XM se duplicó en las mismas fechas, lo que indica un cambio en cómo se forma el precio y no una falla del modelo. Se probaron dos adaptaciones: dar más peso a los datos recientes (empeora) y agregar como variable una aproximación de la curva de referencia de las ofertas hidráulicas de la resolución. Esta última mejora en 2026, pero en los años históricos gana en 2 de 5, empata en 2 y pierde en 2024-25, así que no se adoptó.</w:t>
       </w:r>
     </w:p>
     <w:p>
@@ -11792,6 +11818,3307 @@
     </w:p>
     <w:p>
       <w:pPr>
+        <w:pStyle w:val="Heading2"/>
+      </w:pPr>
+      <w:r>
+        <w:t>9.7 Justificación del diseño: benchmark y walk-forward con información realista</w:t>
+      </w:r>
+    </w:p>
+    <w:p>
+      <w:pPr>
+        <w:jc w:val="both"/>
+      </w:pPr>
+      <w:r>
+        <w:t>Cada componente se eligió con el mismo protocolo: comparar todos los candidatos razonables en las mismas horas, en cinco años históricos (15 de julio a 30 de junio, de 2020-21 a 2024-25) y en 2026, solo con la información pública al corte, y aceptar una diferencia solo si es significativa en la prueba de Diebold-Mariano.</w:t>
+      </w:r>
+    </w:p>
+    <w:p>
+      <w:pPr>
+        <w:keepNext/>
+        <w:spacing w:after="60"/>
+      </w:pPr>
+      <w:r>
+        <w:rPr>
+          <w:b/>
+          <w:color w:val="1F4E79"/>
+          <w:sz w:val="20"/>
+        </w:rPr>
+        <w:t>Tabla 21. MAE (COP/kWh) de los modelos que corrigen el predespacho</w:t>
+      </w:r>
+    </w:p>
+    <w:tbl>
+      <w:tblPr>
+        <w:tblStyle w:val="TableGrid"/>
+        <w:tblW w:type="auto" w:w="0"/>
+        <w:jc w:val="center"/>
+        <w:tblLook w:firstColumn="1" w:firstRow="1" w:lastColumn="0" w:lastRow="0" w:noHBand="0" w:noVBand="1" w:val="04A0"/>
+      </w:tblPr>
+      <w:tblGrid>
+        <w:gridCol w:w="1204"/>
+        <w:gridCol w:w="1204"/>
+        <w:gridCol w:w="1204"/>
+        <w:gridCol w:w="1204"/>
+        <w:gridCol w:w="1204"/>
+        <w:gridCol w:w="1204"/>
+        <w:gridCol w:w="1204"/>
+        <w:gridCol w:w="1204"/>
+      </w:tblGrid>
+      <w:tr>
+        <w:trPr>
+          <w:tblHeader w:val="true"/>
+        </w:trPr>
+        <w:tc>
+          <w:tcPr>
+            <w:tcW w:type="dxa" w:w="3400"/>
+            <w:shd w:val="clear" w:color="auto" w:fill="1F4E79"/>
+          </w:tcPr>
+          <w:p>
+            <w:pPr>
+              <w:spacing w:after="20" w:line="240" w:lineRule="auto"/>
+            </w:pPr>
+            <w:r>
+              <w:rPr>
+                <w:b/>
+                <w:color w:val="FFFFFF"/>
+                <w:sz w:val="17"/>
+              </w:rPr>
+              <w:t>Modelo</w:t>
+            </w:r>
+          </w:p>
+        </w:tc>
+        <w:tc>
+          <w:tcPr>
+            <w:tcW w:type="dxa" w:w="890"/>
+            <w:shd w:val="clear" w:color="auto" w:fill="1F4E79"/>
+          </w:tcPr>
+          <w:p>
+            <w:pPr>
+              <w:spacing w:after="20" w:line="240" w:lineRule="auto"/>
+            </w:pPr>
+            <w:r>
+              <w:rPr>
+                <w:b/>
+                <w:color w:val="FFFFFF"/>
+                <w:sz w:val="17"/>
+              </w:rPr>
+              <w:t>2020-21</w:t>
+            </w:r>
+          </w:p>
+        </w:tc>
+        <w:tc>
+          <w:tcPr>
+            <w:tcW w:type="dxa" w:w="890"/>
+            <w:shd w:val="clear" w:color="auto" w:fill="1F4E79"/>
+          </w:tcPr>
+          <w:p>
+            <w:pPr>
+              <w:spacing w:after="20" w:line="240" w:lineRule="auto"/>
+            </w:pPr>
+            <w:r>
+              <w:rPr>
+                <w:b/>
+                <w:color w:val="FFFFFF"/>
+                <w:sz w:val="17"/>
+              </w:rPr>
+              <w:t>2021-22</w:t>
+            </w:r>
+          </w:p>
+        </w:tc>
+        <w:tc>
+          <w:tcPr>
+            <w:tcW w:type="dxa" w:w="890"/>
+            <w:shd w:val="clear" w:color="auto" w:fill="1F4E79"/>
+          </w:tcPr>
+          <w:p>
+            <w:pPr>
+              <w:spacing w:after="20" w:line="240" w:lineRule="auto"/>
+            </w:pPr>
+            <w:r>
+              <w:rPr>
+                <w:b/>
+                <w:color w:val="FFFFFF"/>
+                <w:sz w:val="17"/>
+              </w:rPr>
+              <w:t>2022-23</w:t>
+            </w:r>
+          </w:p>
+        </w:tc>
+        <w:tc>
+          <w:tcPr>
+            <w:tcW w:type="dxa" w:w="890"/>
+            <w:shd w:val="clear" w:color="auto" w:fill="1F4E79"/>
+          </w:tcPr>
+          <w:p>
+            <w:pPr>
+              <w:spacing w:after="20" w:line="240" w:lineRule="auto"/>
+            </w:pPr>
+            <w:r>
+              <w:rPr>
+                <w:b/>
+                <w:color w:val="FFFFFF"/>
+                <w:sz w:val="17"/>
+              </w:rPr>
+              <w:t>2023-24</w:t>
+            </w:r>
+          </w:p>
+        </w:tc>
+        <w:tc>
+          <w:tcPr>
+            <w:tcW w:type="dxa" w:w="890"/>
+            <w:shd w:val="clear" w:color="auto" w:fill="1F4E79"/>
+          </w:tcPr>
+          <w:p>
+            <w:pPr>
+              <w:spacing w:after="20" w:line="240" w:lineRule="auto"/>
+            </w:pPr>
+            <w:r>
+              <w:rPr>
+                <w:b/>
+                <w:color w:val="FFFFFF"/>
+                <w:sz w:val="17"/>
+              </w:rPr>
+              <w:t>2024-25</w:t>
+            </w:r>
+          </w:p>
+        </w:tc>
+        <w:tc>
+          <w:tcPr>
+            <w:tcW w:type="dxa" w:w="890"/>
+            <w:shd w:val="clear" w:color="auto" w:fill="1F4E79"/>
+          </w:tcPr>
+          <w:p>
+            <w:pPr>
+              <w:spacing w:after="20" w:line="240" w:lineRule="auto"/>
+            </w:pPr>
+            <w:r>
+              <w:rPr>
+                <w:b/>
+                <w:color w:val="FFFFFF"/>
+                <w:sz w:val="17"/>
+              </w:rPr>
+              <w:t>2026</w:t>
+            </w:r>
+          </w:p>
+        </w:tc>
+        <w:tc>
+          <w:tcPr>
+            <w:tcW w:type="dxa" w:w="890"/>
+            <w:shd w:val="clear" w:color="auto" w:fill="1F4E79"/>
+          </w:tcPr>
+          <w:p>
+            <w:pPr>
+              <w:spacing w:after="20" w:line="240" w:lineRule="auto"/>
+            </w:pPr>
+            <w:r>
+              <w:rPr>
+                <w:b/>
+                <w:color w:val="FFFFFF"/>
+                <w:sz w:val="17"/>
+              </w:rPr>
+              <w:t>Media</w:t>
+            </w:r>
+          </w:p>
+        </w:tc>
+      </w:tr>
+      <w:tr>
+        <w:tc>
+          <w:tcPr>
+            <w:tcW w:type="dxa" w:w="3400"/>
+          </w:tcPr>
+          <w:p>
+            <w:pPr>
+              <w:spacing w:after="20" w:line="240" w:lineRule="auto"/>
+            </w:pPr>
+            <w:r>
+              <w:rPr>
+                <w:sz w:val="17"/>
+              </w:rPr>
+              <w:t>Persistencia</w:t>
+            </w:r>
+          </w:p>
+        </w:tc>
+        <w:tc>
+          <w:tcPr>
+            <w:tcW w:type="dxa" w:w="890"/>
+          </w:tcPr>
+          <w:p>
+            <w:pPr>
+              <w:spacing w:after="20" w:line="240" w:lineRule="auto"/>
+            </w:pPr>
+            <w:r>
+              <w:rPr>
+                <w:sz w:val="17"/>
+              </w:rPr>
+              <w:t>26,6</w:t>
+            </w:r>
+          </w:p>
+        </w:tc>
+        <w:tc>
+          <w:tcPr>
+            <w:tcW w:type="dxa" w:w="890"/>
+          </w:tcPr>
+          <w:p>
+            <w:pPr>
+              <w:spacing w:after="20" w:line="240" w:lineRule="auto"/>
+            </w:pPr>
+            <w:r>
+              <w:rPr>
+                <w:sz w:val="17"/>
+              </w:rPr>
+              <w:t>37,0</w:t>
+            </w:r>
+          </w:p>
+        </w:tc>
+        <w:tc>
+          <w:tcPr>
+            <w:tcW w:type="dxa" w:w="890"/>
+          </w:tcPr>
+          <w:p>
+            <w:pPr>
+              <w:spacing w:after="20" w:line="240" w:lineRule="auto"/>
+            </w:pPr>
+            <w:r>
+              <w:rPr>
+                <w:sz w:val="17"/>
+              </w:rPr>
+              <w:t>87,5</w:t>
+            </w:r>
+          </w:p>
+        </w:tc>
+        <w:tc>
+          <w:tcPr>
+            <w:tcW w:type="dxa" w:w="890"/>
+          </w:tcPr>
+          <w:p>
+            <w:pPr>
+              <w:spacing w:after="20" w:line="240" w:lineRule="auto"/>
+            </w:pPr>
+            <w:r>
+              <w:rPr>
+                <w:sz w:val="17"/>
+              </w:rPr>
+              <w:t>137,6</w:t>
+            </w:r>
+          </w:p>
+        </w:tc>
+        <w:tc>
+          <w:tcPr>
+            <w:tcW w:type="dxa" w:w="890"/>
+          </w:tcPr>
+          <w:p>
+            <w:pPr>
+              <w:spacing w:after="20" w:line="240" w:lineRule="auto"/>
+            </w:pPr>
+            <w:r>
+              <w:rPr>
+                <w:sz w:val="17"/>
+              </w:rPr>
+              <w:t>161,4</w:t>
+            </w:r>
+          </w:p>
+        </w:tc>
+        <w:tc>
+          <w:tcPr>
+            <w:tcW w:type="dxa" w:w="890"/>
+          </w:tcPr>
+          <w:p>
+            <w:pPr>
+              <w:spacing w:after="20" w:line="240" w:lineRule="auto"/>
+            </w:pPr>
+            <w:r>
+              <w:rPr>
+                <w:sz w:val="17"/>
+              </w:rPr>
+              <w:t>117,9</w:t>
+            </w:r>
+          </w:p>
+        </w:tc>
+        <w:tc>
+          <w:tcPr>
+            <w:tcW w:type="dxa" w:w="890"/>
+          </w:tcPr>
+          <w:p>
+            <w:pPr>
+              <w:spacing w:after="20" w:line="240" w:lineRule="auto"/>
+            </w:pPr>
+            <w:r>
+              <w:rPr>
+                <w:sz w:val="17"/>
+              </w:rPr>
+              <w:t>94,65</w:t>
+            </w:r>
+          </w:p>
+        </w:tc>
+      </w:tr>
+      <w:tr>
+        <w:tc>
+          <w:tcPr>
+            <w:tcW w:type="dxa" w:w="3400"/>
+            <w:shd w:val="clear" w:color="auto" w:fill="F3F6FA"/>
+          </w:tcPr>
+          <w:p>
+            <w:pPr>
+              <w:spacing w:after="20" w:line="240" w:lineRule="auto"/>
+            </w:pPr>
+            <w:r>
+              <w:rPr>
+                <w:sz w:val="17"/>
+              </w:rPr>
+              <w:t>Predespacho de XM solo</w:t>
+            </w:r>
+          </w:p>
+        </w:tc>
+        <w:tc>
+          <w:tcPr>
+            <w:tcW w:type="dxa" w:w="890"/>
+            <w:shd w:val="clear" w:color="auto" w:fill="F3F6FA"/>
+          </w:tcPr>
+          <w:p>
+            <w:pPr>
+              <w:spacing w:after="20" w:line="240" w:lineRule="auto"/>
+            </w:pPr>
+            <w:r>
+              <w:rPr>
+                <w:sz w:val="17"/>
+              </w:rPr>
+              <w:t>13,6</w:t>
+            </w:r>
+          </w:p>
+        </w:tc>
+        <w:tc>
+          <w:tcPr>
+            <w:tcW w:type="dxa" w:w="890"/>
+            <w:shd w:val="clear" w:color="auto" w:fill="F3F6FA"/>
+          </w:tcPr>
+          <w:p>
+            <w:pPr>
+              <w:spacing w:after="20" w:line="240" w:lineRule="auto"/>
+            </w:pPr>
+            <w:r>
+              <w:rPr>
+                <w:sz w:val="17"/>
+              </w:rPr>
+              <w:t>12,5</w:t>
+            </w:r>
+          </w:p>
+        </w:tc>
+        <w:tc>
+          <w:tcPr>
+            <w:tcW w:type="dxa" w:w="890"/>
+            <w:shd w:val="clear" w:color="auto" w:fill="F3F6FA"/>
+          </w:tcPr>
+          <w:p>
+            <w:pPr>
+              <w:spacing w:after="20" w:line="240" w:lineRule="auto"/>
+            </w:pPr>
+            <w:r>
+              <w:rPr>
+                <w:sz w:val="17"/>
+              </w:rPr>
+              <w:t>23,5</w:t>
+            </w:r>
+          </w:p>
+        </w:tc>
+        <w:tc>
+          <w:tcPr>
+            <w:tcW w:type="dxa" w:w="890"/>
+            <w:shd w:val="clear" w:color="auto" w:fill="F3F6FA"/>
+          </w:tcPr>
+          <w:p>
+            <w:pPr>
+              <w:spacing w:after="20" w:line="240" w:lineRule="auto"/>
+            </w:pPr>
+            <w:r>
+              <w:rPr>
+                <w:sz w:val="17"/>
+              </w:rPr>
+              <w:t>37,0</w:t>
+            </w:r>
+          </w:p>
+        </w:tc>
+        <w:tc>
+          <w:tcPr>
+            <w:tcW w:type="dxa" w:w="890"/>
+            <w:shd w:val="clear" w:color="auto" w:fill="F3F6FA"/>
+          </w:tcPr>
+          <w:p>
+            <w:pPr>
+              <w:spacing w:after="20" w:line="240" w:lineRule="auto"/>
+            </w:pPr>
+            <w:r>
+              <w:rPr>
+                <w:sz w:val="17"/>
+              </w:rPr>
+              <w:t>59,5</w:t>
+            </w:r>
+          </w:p>
+        </w:tc>
+        <w:tc>
+          <w:tcPr>
+            <w:tcW w:type="dxa" w:w="890"/>
+            <w:shd w:val="clear" w:color="auto" w:fill="F3F6FA"/>
+          </w:tcPr>
+          <w:p>
+            <w:pPr>
+              <w:spacing w:after="20" w:line="240" w:lineRule="auto"/>
+            </w:pPr>
+            <w:r>
+              <w:rPr>
+                <w:sz w:val="17"/>
+              </w:rPr>
+              <w:t>42,0</w:t>
+            </w:r>
+          </w:p>
+        </w:tc>
+        <w:tc>
+          <w:tcPr>
+            <w:tcW w:type="dxa" w:w="890"/>
+            <w:shd w:val="clear" w:color="auto" w:fill="F3F6FA"/>
+          </w:tcPr>
+          <w:p>
+            <w:pPr>
+              <w:spacing w:after="20" w:line="240" w:lineRule="auto"/>
+            </w:pPr>
+            <w:r>
+              <w:rPr>
+                <w:sz w:val="17"/>
+              </w:rPr>
+              <w:t>31,37</w:t>
+            </w:r>
+          </w:p>
+        </w:tc>
+      </w:tr>
+      <w:tr>
+        <w:tc>
+          <w:tcPr>
+            <w:tcW w:type="dxa" w:w="3400"/>
+          </w:tcPr>
+          <w:p>
+            <w:pPr>
+              <w:spacing w:after="20" w:line="240" w:lineRule="auto"/>
+            </w:pPr>
+            <w:r>
+              <w:rPr>
+                <w:sz w:val="17"/>
+              </w:rPr>
+              <w:t>Predespacho + CatBoost (Augur)</w:t>
+            </w:r>
+          </w:p>
+        </w:tc>
+        <w:tc>
+          <w:tcPr>
+            <w:tcW w:type="dxa" w:w="890"/>
+          </w:tcPr>
+          <w:p>
+            <w:pPr>
+              <w:spacing w:after="20" w:line="240" w:lineRule="auto"/>
+            </w:pPr>
+            <w:r>
+              <w:rPr>
+                <w:sz w:val="17"/>
+              </w:rPr>
+              <w:t>9,3</w:t>
+            </w:r>
+          </w:p>
+        </w:tc>
+        <w:tc>
+          <w:tcPr>
+            <w:tcW w:type="dxa" w:w="890"/>
+          </w:tcPr>
+          <w:p>
+            <w:pPr>
+              <w:spacing w:after="20" w:line="240" w:lineRule="auto"/>
+            </w:pPr>
+            <w:r>
+              <w:rPr>
+                <w:sz w:val="17"/>
+              </w:rPr>
+              <w:t>12,0</w:t>
+            </w:r>
+          </w:p>
+        </w:tc>
+        <w:tc>
+          <w:tcPr>
+            <w:tcW w:type="dxa" w:w="890"/>
+          </w:tcPr>
+          <w:p>
+            <w:pPr>
+              <w:spacing w:after="20" w:line="240" w:lineRule="auto"/>
+            </w:pPr>
+            <w:r>
+              <w:rPr>
+                <w:sz w:val="17"/>
+              </w:rPr>
+              <w:t>21,2</w:t>
+            </w:r>
+          </w:p>
+        </w:tc>
+        <w:tc>
+          <w:tcPr>
+            <w:tcW w:type="dxa" w:w="890"/>
+          </w:tcPr>
+          <w:p>
+            <w:pPr>
+              <w:spacing w:after="20" w:line="240" w:lineRule="auto"/>
+            </w:pPr>
+            <w:r>
+              <w:rPr>
+                <w:sz w:val="17"/>
+              </w:rPr>
+              <w:t>36,3</w:t>
+            </w:r>
+          </w:p>
+        </w:tc>
+        <w:tc>
+          <w:tcPr>
+            <w:tcW w:type="dxa" w:w="890"/>
+          </w:tcPr>
+          <w:p>
+            <w:pPr>
+              <w:spacing w:after="20" w:line="240" w:lineRule="auto"/>
+            </w:pPr>
+            <w:r>
+              <w:rPr>
+                <w:sz w:val="17"/>
+              </w:rPr>
+              <w:t>56,7</w:t>
+            </w:r>
+          </w:p>
+        </w:tc>
+        <w:tc>
+          <w:tcPr>
+            <w:tcW w:type="dxa" w:w="890"/>
+          </w:tcPr>
+          <w:p>
+            <w:pPr>
+              <w:spacing w:after="20" w:line="240" w:lineRule="auto"/>
+            </w:pPr>
+            <w:r>
+              <w:rPr>
+                <w:sz w:val="17"/>
+              </w:rPr>
+              <w:t>38,8</w:t>
+            </w:r>
+          </w:p>
+        </w:tc>
+        <w:tc>
+          <w:tcPr>
+            <w:tcW w:type="dxa" w:w="890"/>
+          </w:tcPr>
+          <w:p>
+            <w:pPr>
+              <w:spacing w:after="20" w:line="240" w:lineRule="auto"/>
+            </w:pPr>
+            <w:r>
+              <w:rPr>
+                <w:sz w:val="17"/>
+              </w:rPr>
+              <w:t>29,05</w:t>
+            </w:r>
+          </w:p>
+        </w:tc>
+      </w:tr>
+      <w:tr>
+        <w:tc>
+          <w:tcPr>
+            <w:tcW w:type="dxa" w:w="3400"/>
+            <w:shd w:val="clear" w:color="auto" w:fill="F3F6FA"/>
+          </w:tcPr>
+          <w:p>
+            <w:pPr>
+              <w:spacing w:after="20" w:line="240" w:lineRule="auto"/>
+            </w:pPr>
+            <w:r>
+              <w:rPr>
+                <w:sz w:val="17"/>
+              </w:rPr>
+              <w:t>Predespacho + LightGBM</w:t>
+            </w:r>
+          </w:p>
+        </w:tc>
+        <w:tc>
+          <w:tcPr>
+            <w:tcW w:type="dxa" w:w="890"/>
+            <w:shd w:val="clear" w:color="auto" w:fill="F3F6FA"/>
+          </w:tcPr>
+          <w:p>
+            <w:pPr>
+              <w:spacing w:after="20" w:line="240" w:lineRule="auto"/>
+            </w:pPr>
+            <w:r>
+              <w:rPr>
+                <w:sz w:val="17"/>
+              </w:rPr>
+              <w:t>9,3</w:t>
+            </w:r>
+          </w:p>
+        </w:tc>
+        <w:tc>
+          <w:tcPr>
+            <w:tcW w:type="dxa" w:w="890"/>
+            <w:shd w:val="clear" w:color="auto" w:fill="F3F6FA"/>
+          </w:tcPr>
+          <w:p>
+            <w:pPr>
+              <w:spacing w:after="20" w:line="240" w:lineRule="auto"/>
+            </w:pPr>
+            <w:r>
+              <w:rPr>
+                <w:sz w:val="17"/>
+              </w:rPr>
+              <w:t>11,9</w:t>
+            </w:r>
+          </w:p>
+        </w:tc>
+        <w:tc>
+          <w:tcPr>
+            <w:tcW w:type="dxa" w:w="890"/>
+            <w:shd w:val="clear" w:color="auto" w:fill="F3F6FA"/>
+          </w:tcPr>
+          <w:p>
+            <w:pPr>
+              <w:spacing w:after="20" w:line="240" w:lineRule="auto"/>
+            </w:pPr>
+            <w:r>
+              <w:rPr>
+                <w:sz w:val="17"/>
+              </w:rPr>
+              <w:t>21,2</w:t>
+            </w:r>
+          </w:p>
+        </w:tc>
+        <w:tc>
+          <w:tcPr>
+            <w:tcW w:type="dxa" w:w="890"/>
+            <w:shd w:val="clear" w:color="auto" w:fill="F3F6FA"/>
+          </w:tcPr>
+          <w:p>
+            <w:pPr>
+              <w:spacing w:after="20" w:line="240" w:lineRule="auto"/>
+            </w:pPr>
+            <w:r>
+              <w:rPr>
+                <w:sz w:val="17"/>
+              </w:rPr>
+              <w:t>36,3</w:t>
+            </w:r>
+          </w:p>
+        </w:tc>
+        <w:tc>
+          <w:tcPr>
+            <w:tcW w:type="dxa" w:w="890"/>
+            <w:shd w:val="clear" w:color="auto" w:fill="F3F6FA"/>
+          </w:tcPr>
+          <w:p>
+            <w:pPr>
+              <w:spacing w:after="20" w:line="240" w:lineRule="auto"/>
+            </w:pPr>
+            <w:r>
+              <w:rPr>
+                <w:sz w:val="17"/>
+              </w:rPr>
+              <w:t>56,9</w:t>
+            </w:r>
+          </w:p>
+        </w:tc>
+        <w:tc>
+          <w:tcPr>
+            <w:tcW w:type="dxa" w:w="890"/>
+            <w:shd w:val="clear" w:color="auto" w:fill="F3F6FA"/>
+          </w:tcPr>
+          <w:p>
+            <w:pPr>
+              <w:spacing w:after="20" w:line="240" w:lineRule="auto"/>
+            </w:pPr>
+            <w:r>
+              <w:rPr>
+                <w:sz w:val="17"/>
+              </w:rPr>
+              <w:t>38,8</w:t>
+            </w:r>
+          </w:p>
+        </w:tc>
+        <w:tc>
+          <w:tcPr>
+            <w:tcW w:type="dxa" w:w="890"/>
+            <w:shd w:val="clear" w:color="auto" w:fill="F3F6FA"/>
+          </w:tcPr>
+          <w:p>
+            <w:pPr>
+              <w:spacing w:after="20" w:line="240" w:lineRule="auto"/>
+            </w:pPr>
+            <w:r>
+              <w:rPr>
+                <w:sz w:val="17"/>
+              </w:rPr>
+              <w:t>29,09</w:t>
+            </w:r>
+          </w:p>
+        </w:tc>
+      </w:tr>
+      <w:tr>
+        <w:tc>
+          <w:tcPr>
+            <w:tcW w:type="dxa" w:w="3400"/>
+          </w:tcPr>
+          <w:p>
+            <w:pPr>
+              <w:spacing w:after="20" w:line="240" w:lineRule="auto"/>
+            </w:pPr>
+            <w:r>
+              <w:rPr>
+                <w:sz w:val="17"/>
+              </w:rPr>
+              <w:t>Predespacho + Random Forest</w:t>
+            </w:r>
+          </w:p>
+        </w:tc>
+        <w:tc>
+          <w:tcPr>
+            <w:tcW w:type="dxa" w:w="890"/>
+          </w:tcPr>
+          <w:p>
+            <w:pPr>
+              <w:spacing w:after="20" w:line="240" w:lineRule="auto"/>
+            </w:pPr>
+            <w:r>
+              <w:rPr>
+                <w:sz w:val="17"/>
+              </w:rPr>
+              <w:t>9,4</w:t>
+            </w:r>
+          </w:p>
+        </w:tc>
+        <w:tc>
+          <w:tcPr>
+            <w:tcW w:type="dxa" w:w="890"/>
+          </w:tcPr>
+          <w:p>
+            <w:pPr>
+              <w:spacing w:after="20" w:line="240" w:lineRule="auto"/>
+            </w:pPr>
+            <w:r>
+              <w:rPr>
+                <w:sz w:val="17"/>
+              </w:rPr>
+              <w:t>11,6</w:t>
+            </w:r>
+          </w:p>
+        </w:tc>
+        <w:tc>
+          <w:tcPr>
+            <w:tcW w:type="dxa" w:w="890"/>
+          </w:tcPr>
+          <w:p>
+            <w:pPr>
+              <w:spacing w:after="20" w:line="240" w:lineRule="auto"/>
+            </w:pPr>
+            <w:r>
+              <w:rPr>
+                <w:sz w:val="17"/>
+              </w:rPr>
+              <w:t>21,2</w:t>
+            </w:r>
+          </w:p>
+        </w:tc>
+        <w:tc>
+          <w:tcPr>
+            <w:tcW w:type="dxa" w:w="890"/>
+          </w:tcPr>
+          <w:p>
+            <w:pPr>
+              <w:spacing w:after="20" w:line="240" w:lineRule="auto"/>
+            </w:pPr>
+            <w:r>
+              <w:rPr>
+                <w:sz w:val="17"/>
+              </w:rPr>
+              <w:t>36,3</w:t>
+            </w:r>
+          </w:p>
+        </w:tc>
+        <w:tc>
+          <w:tcPr>
+            <w:tcW w:type="dxa" w:w="890"/>
+          </w:tcPr>
+          <w:p>
+            <w:pPr>
+              <w:spacing w:after="20" w:line="240" w:lineRule="auto"/>
+            </w:pPr>
+            <w:r>
+              <w:rPr>
+                <w:sz w:val="17"/>
+              </w:rPr>
+              <w:t>56,9</w:t>
+            </w:r>
+          </w:p>
+        </w:tc>
+        <w:tc>
+          <w:tcPr>
+            <w:tcW w:type="dxa" w:w="890"/>
+          </w:tcPr>
+          <w:p>
+            <w:pPr>
+              <w:spacing w:after="20" w:line="240" w:lineRule="auto"/>
+            </w:pPr>
+            <w:r>
+              <w:rPr>
+                <w:sz w:val="17"/>
+              </w:rPr>
+              <w:t>39,0</w:t>
+            </w:r>
+          </w:p>
+        </w:tc>
+        <w:tc>
+          <w:tcPr>
+            <w:tcW w:type="dxa" w:w="890"/>
+          </w:tcPr>
+          <w:p>
+            <w:pPr>
+              <w:spacing w:after="20" w:line="240" w:lineRule="auto"/>
+            </w:pPr>
+            <w:r>
+              <w:rPr>
+                <w:sz w:val="17"/>
+              </w:rPr>
+              <w:t>29,06</w:t>
+            </w:r>
+          </w:p>
+        </w:tc>
+      </w:tr>
+      <w:tr>
+        <w:tc>
+          <w:tcPr>
+            <w:tcW w:type="dxa" w:w="3400"/>
+            <w:shd w:val="clear" w:color="auto" w:fill="F3F6FA"/>
+          </w:tcPr>
+          <w:p>
+            <w:pPr>
+              <w:spacing w:after="20" w:line="240" w:lineRule="auto"/>
+            </w:pPr>
+            <w:r>
+              <w:rPr>
+                <w:sz w:val="17"/>
+              </w:rPr>
+              <w:t>Predespacho + XGBoost</w:t>
+            </w:r>
+          </w:p>
+        </w:tc>
+        <w:tc>
+          <w:tcPr>
+            <w:tcW w:type="dxa" w:w="890"/>
+            <w:shd w:val="clear" w:color="auto" w:fill="F3F6FA"/>
+          </w:tcPr>
+          <w:p>
+            <w:pPr>
+              <w:spacing w:after="20" w:line="240" w:lineRule="auto"/>
+            </w:pPr>
+            <w:r>
+              <w:rPr>
+                <w:sz w:val="17"/>
+              </w:rPr>
+              <w:t>9,4</w:t>
+            </w:r>
+          </w:p>
+        </w:tc>
+        <w:tc>
+          <w:tcPr>
+            <w:tcW w:type="dxa" w:w="890"/>
+            <w:shd w:val="clear" w:color="auto" w:fill="F3F6FA"/>
+          </w:tcPr>
+          <w:p>
+            <w:pPr>
+              <w:spacing w:after="20" w:line="240" w:lineRule="auto"/>
+            </w:pPr>
+            <w:r>
+              <w:rPr>
+                <w:sz w:val="17"/>
+              </w:rPr>
+              <w:t>12,6</w:t>
+            </w:r>
+          </w:p>
+        </w:tc>
+        <w:tc>
+          <w:tcPr>
+            <w:tcW w:type="dxa" w:w="890"/>
+            <w:shd w:val="clear" w:color="auto" w:fill="F3F6FA"/>
+          </w:tcPr>
+          <w:p>
+            <w:pPr>
+              <w:spacing w:after="20" w:line="240" w:lineRule="auto"/>
+            </w:pPr>
+            <w:r>
+              <w:rPr>
+                <w:sz w:val="17"/>
+              </w:rPr>
+              <w:t>21,2</w:t>
+            </w:r>
+          </w:p>
+        </w:tc>
+        <w:tc>
+          <w:tcPr>
+            <w:tcW w:type="dxa" w:w="890"/>
+            <w:shd w:val="clear" w:color="auto" w:fill="F3F6FA"/>
+          </w:tcPr>
+          <w:p>
+            <w:pPr>
+              <w:spacing w:after="20" w:line="240" w:lineRule="auto"/>
+            </w:pPr>
+            <w:r>
+              <w:rPr>
+                <w:sz w:val="17"/>
+              </w:rPr>
+              <w:t>36,3</w:t>
+            </w:r>
+          </w:p>
+        </w:tc>
+        <w:tc>
+          <w:tcPr>
+            <w:tcW w:type="dxa" w:w="890"/>
+            <w:shd w:val="clear" w:color="auto" w:fill="F3F6FA"/>
+          </w:tcPr>
+          <w:p>
+            <w:pPr>
+              <w:spacing w:after="20" w:line="240" w:lineRule="auto"/>
+            </w:pPr>
+            <w:r>
+              <w:rPr>
+                <w:sz w:val="17"/>
+              </w:rPr>
+              <w:t>56,9</w:t>
+            </w:r>
+          </w:p>
+        </w:tc>
+        <w:tc>
+          <w:tcPr>
+            <w:tcW w:type="dxa" w:w="890"/>
+            <w:shd w:val="clear" w:color="auto" w:fill="F3F6FA"/>
+          </w:tcPr>
+          <w:p>
+            <w:pPr>
+              <w:spacing w:after="20" w:line="240" w:lineRule="auto"/>
+            </w:pPr>
+            <w:r>
+              <w:rPr>
+                <w:sz w:val="17"/>
+              </w:rPr>
+              <w:t>39,0</w:t>
+            </w:r>
+          </w:p>
+        </w:tc>
+        <w:tc>
+          <w:tcPr>
+            <w:tcW w:type="dxa" w:w="890"/>
+            <w:shd w:val="clear" w:color="auto" w:fill="F3F6FA"/>
+          </w:tcPr>
+          <w:p>
+            <w:pPr>
+              <w:spacing w:after="20" w:line="240" w:lineRule="auto"/>
+            </w:pPr>
+            <w:r>
+              <w:rPr>
+                <w:sz w:val="17"/>
+              </w:rPr>
+              <w:t>29,23</w:t>
+            </w:r>
+          </w:p>
+        </w:tc>
+      </w:tr>
+      <w:tr>
+        <w:tc>
+          <w:tcPr>
+            <w:tcW w:type="dxa" w:w="3400"/>
+          </w:tcPr>
+          <w:p>
+            <w:pPr>
+              <w:spacing w:after="20" w:line="240" w:lineRule="auto"/>
+            </w:pPr>
+            <w:r>
+              <w:rPr>
+                <w:sz w:val="17"/>
+              </w:rPr>
+              <w:t>Predespacho + Lasso (lineal, tipo LEAR)</w:t>
+            </w:r>
+          </w:p>
+        </w:tc>
+        <w:tc>
+          <w:tcPr>
+            <w:tcW w:type="dxa" w:w="890"/>
+          </w:tcPr>
+          <w:p>
+            <w:pPr>
+              <w:spacing w:after="20" w:line="240" w:lineRule="auto"/>
+            </w:pPr>
+            <w:r>
+              <w:rPr>
+                <w:sz w:val="17"/>
+              </w:rPr>
+              <w:t>9,4</w:t>
+            </w:r>
+          </w:p>
+        </w:tc>
+        <w:tc>
+          <w:tcPr>
+            <w:tcW w:type="dxa" w:w="890"/>
+          </w:tcPr>
+          <w:p>
+            <w:pPr>
+              <w:spacing w:after="20" w:line="240" w:lineRule="auto"/>
+            </w:pPr>
+            <w:r>
+              <w:rPr>
+                <w:sz w:val="17"/>
+              </w:rPr>
+              <w:t>12,1</w:t>
+            </w:r>
+          </w:p>
+        </w:tc>
+        <w:tc>
+          <w:tcPr>
+            <w:tcW w:type="dxa" w:w="890"/>
+          </w:tcPr>
+          <w:p>
+            <w:pPr>
+              <w:spacing w:after="20" w:line="240" w:lineRule="auto"/>
+            </w:pPr>
+            <w:r>
+              <w:rPr>
+                <w:sz w:val="17"/>
+              </w:rPr>
+              <w:t>21,3</w:t>
+            </w:r>
+          </w:p>
+        </w:tc>
+        <w:tc>
+          <w:tcPr>
+            <w:tcW w:type="dxa" w:w="890"/>
+          </w:tcPr>
+          <w:p>
+            <w:pPr>
+              <w:spacing w:after="20" w:line="240" w:lineRule="auto"/>
+            </w:pPr>
+            <w:r>
+              <w:rPr>
+                <w:sz w:val="17"/>
+              </w:rPr>
+              <w:t>36,4</w:t>
+            </w:r>
+          </w:p>
+        </w:tc>
+        <w:tc>
+          <w:tcPr>
+            <w:tcW w:type="dxa" w:w="890"/>
+          </w:tcPr>
+          <w:p>
+            <w:pPr>
+              <w:spacing w:after="20" w:line="240" w:lineRule="auto"/>
+            </w:pPr>
+            <w:r>
+              <w:rPr>
+                <w:sz w:val="17"/>
+              </w:rPr>
+              <w:t>56,9</w:t>
+            </w:r>
+          </w:p>
+        </w:tc>
+        <w:tc>
+          <w:tcPr>
+            <w:tcW w:type="dxa" w:w="890"/>
+          </w:tcPr>
+          <w:p>
+            <w:pPr>
+              <w:spacing w:after="20" w:line="240" w:lineRule="auto"/>
+            </w:pPr>
+            <w:r>
+              <w:rPr>
+                <w:sz w:val="17"/>
+              </w:rPr>
+              <w:t>39,4</w:t>
+            </w:r>
+          </w:p>
+        </w:tc>
+        <w:tc>
+          <w:tcPr>
+            <w:tcW w:type="dxa" w:w="890"/>
+          </w:tcPr>
+          <w:p>
+            <w:pPr>
+              <w:spacing w:after="20" w:line="240" w:lineRule="auto"/>
+            </w:pPr>
+            <w:r>
+              <w:rPr>
+                <w:sz w:val="17"/>
+              </w:rPr>
+              <w:t>29,24</w:t>
+            </w:r>
+          </w:p>
+        </w:tc>
+      </w:tr>
+    </w:tbl>
+    <w:p>
+      <w:r>
+        <w:rPr>
+          <w:color w:val="595959"/>
+          <w:sz w:val="17"/>
+        </w:rPr>
+        <w:t>Mismas variables, objetivo, reentrenamiento mensual y presupuesto (1.500 árboles, profundidad 6), sin afinar ningún modelo. Los cuatro de árboles no tienen diferencias significativas consistentes entre sí; el lineal es significativamente peor en 3 de 6 periodos. CatBoost tiene la mejor media.</w:t>
+      </w:r>
+    </w:p>
+    <w:p>
+      <w:pPr>
+        <w:keepNext/>
+        <w:spacing w:after="60"/>
+      </w:pPr>
+      <w:r>
+        <w:rPr>
+          <w:b/>
+          <w:color w:val="1F4E79"/>
+          <w:sz w:val="20"/>
+        </w:rPr>
+        <w:t>Tabla 22. Walk-forward con información realista: MAE (COP/kWh) y periodos en que cada modelo es significativamente mejor o peor que la persistencia</w:t>
+      </w:r>
+    </w:p>
+    <w:tbl>
+      <w:tblPr>
+        <w:tblStyle w:val="TableGrid"/>
+        <w:tblW w:type="auto" w:w="0"/>
+        <w:jc w:val="center"/>
+        <w:tblLook w:firstColumn="1" w:firstRow="1" w:lastColumn="0" w:lastRow="0" w:noHBand="0" w:noVBand="1" w:val="04A0"/>
+      </w:tblPr>
+      <w:tblGrid>
+        <w:gridCol w:w="1204"/>
+        <w:gridCol w:w="1204"/>
+        <w:gridCol w:w="1204"/>
+        <w:gridCol w:w="1204"/>
+        <w:gridCol w:w="1204"/>
+        <w:gridCol w:w="1204"/>
+        <w:gridCol w:w="1204"/>
+        <w:gridCol w:w="1204"/>
+      </w:tblGrid>
+      <w:tr>
+        <w:trPr>
+          <w:tblHeader w:val="true"/>
+        </w:trPr>
+        <w:tc>
+          <w:tcPr>
+            <w:tcW w:type="dxa" w:w="3042"/>
+            <w:shd w:val="clear" w:color="auto" w:fill="1F4E79"/>
+          </w:tcPr>
+          <w:p>
+            <w:pPr>
+              <w:spacing w:after="20" w:line="240" w:lineRule="auto"/>
+            </w:pPr>
+            <w:r>
+              <w:rPr>
+                <w:b/>
+                <w:color w:val="FFFFFF"/>
+                <w:sz w:val="17"/>
+              </w:rPr>
+              <w:t>Modelo</w:t>
+            </w:r>
+          </w:p>
+        </w:tc>
+        <w:tc>
+          <w:tcPr>
+            <w:tcW w:type="dxa" w:w="887"/>
+            <w:shd w:val="clear" w:color="auto" w:fill="1F4E79"/>
+          </w:tcPr>
+          <w:p>
+            <w:pPr>
+              <w:spacing w:after="20" w:line="240" w:lineRule="auto"/>
+            </w:pPr>
+            <w:r>
+              <w:rPr>
+                <w:b/>
+                <w:color w:val="FFFFFF"/>
+                <w:sz w:val="17"/>
+              </w:rPr>
+              <w:t>2020-21</w:t>
+            </w:r>
+          </w:p>
+        </w:tc>
+        <w:tc>
+          <w:tcPr>
+            <w:tcW w:type="dxa" w:w="887"/>
+            <w:shd w:val="clear" w:color="auto" w:fill="1F4E79"/>
+          </w:tcPr>
+          <w:p>
+            <w:pPr>
+              <w:spacing w:after="20" w:line="240" w:lineRule="auto"/>
+            </w:pPr>
+            <w:r>
+              <w:rPr>
+                <w:b/>
+                <w:color w:val="FFFFFF"/>
+                <w:sz w:val="17"/>
+              </w:rPr>
+              <w:t>2021-22</w:t>
+            </w:r>
+          </w:p>
+        </w:tc>
+        <w:tc>
+          <w:tcPr>
+            <w:tcW w:type="dxa" w:w="887"/>
+            <w:shd w:val="clear" w:color="auto" w:fill="1F4E79"/>
+          </w:tcPr>
+          <w:p>
+            <w:pPr>
+              <w:spacing w:after="20" w:line="240" w:lineRule="auto"/>
+            </w:pPr>
+            <w:r>
+              <w:rPr>
+                <w:b/>
+                <w:color w:val="FFFFFF"/>
+                <w:sz w:val="17"/>
+              </w:rPr>
+              <w:t>2022-23</w:t>
+            </w:r>
+          </w:p>
+        </w:tc>
+        <w:tc>
+          <w:tcPr>
+            <w:tcW w:type="dxa" w:w="887"/>
+            <w:shd w:val="clear" w:color="auto" w:fill="1F4E79"/>
+          </w:tcPr>
+          <w:p>
+            <w:pPr>
+              <w:spacing w:after="20" w:line="240" w:lineRule="auto"/>
+            </w:pPr>
+            <w:r>
+              <w:rPr>
+                <w:b/>
+                <w:color w:val="FFFFFF"/>
+                <w:sz w:val="17"/>
+              </w:rPr>
+              <w:t>2023-24</w:t>
+            </w:r>
+          </w:p>
+        </w:tc>
+        <w:tc>
+          <w:tcPr>
+            <w:tcW w:type="dxa" w:w="887"/>
+            <w:shd w:val="clear" w:color="auto" w:fill="1F4E79"/>
+          </w:tcPr>
+          <w:p>
+            <w:pPr>
+              <w:spacing w:after="20" w:line="240" w:lineRule="auto"/>
+            </w:pPr>
+            <w:r>
+              <w:rPr>
+                <w:b/>
+                <w:color w:val="FFFFFF"/>
+                <w:sz w:val="17"/>
+              </w:rPr>
+              <w:t>2024-25</w:t>
+            </w:r>
+          </w:p>
+        </w:tc>
+        <w:tc>
+          <w:tcPr>
+            <w:tcW w:type="dxa" w:w="887"/>
+            <w:shd w:val="clear" w:color="auto" w:fill="1F4E79"/>
+          </w:tcPr>
+          <w:p>
+            <w:pPr>
+              <w:spacing w:after="20" w:line="240" w:lineRule="auto"/>
+            </w:pPr>
+            <w:r>
+              <w:rPr>
+                <w:b/>
+                <w:color w:val="FFFFFF"/>
+                <w:sz w:val="17"/>
+              </w:rPr>
+              <w:t>2026</w:t>
+            </w:r>
+          </w:p>
+        </w:tc>
+        <w:tc>
+          <w:tcPr>
+            <w:tcW w:type="dxa" w:w="1267"/>
+            <w:shd w:val="clear" w:color="auto" w:fill="1F4E79"/>
+          </w:tcPr>
+          <w:p>
+            <w:pPr>
+              <w:spacing w:after="20" w:line="240" w:lineRule="auto"/>
+            </w:pPr>
+            <w:r>
+              <w:rPr>
+                <w:b/>
+                <w:color w:val="FFFFFF"/>
+                <w:sz w:val="17"/>
+              </w:rPr>
+              <w:t>Mejor / peor</w:t>
+            </w:r>
+          </w:p>
+        </w:tc>
+      </w:tr>
+      <w:tr>
+        <w:tc>
+          <w:tcPr>
+            <w:tcW w:type="dxa" w:w="3042"/>
+          </w:tcPr>
+          <w:p>
+            <w:pPr>
+              <w:spacing w:after="20" w:line="240" w:lineRule="auto"/>
+            </w:pPr>
+            <w:r>
+              <w:rPr>
+                <w:sz w:val="17"/>
+              </w:rPr>
+              <w:t>Persistencia</w:t>
+            </w:r>
+          </w:p>
+        </w:tc>
+        <w:tc>
+          <w:tcPr>
+            <w:tcW w:type="dxa" w:w="887"/>
+          </w:tcPr>
+          <w:p>
+            <w:pPr>
+              <w:spacing w:after="20" w:line="240" w:lineRule="auto"/>
+            </w:pPr>
+            <w:r>
+              <w:rPr>
+                <w:sz w:val="17"/>
+              </w:rPr>
+              <w:t>26,6</w:t>
+            </w:r>
+          </w:p>
+        </w:tc>
+        <w:tc>
+          <w:tcPr>
+            <w:tcW w:type="dxa" w:w="887"/>
+          </w:tcPr>
+          <w:p>
+            <w:pPr>
+              <w:spacing w:after="20" w:line="240" w:lineRule="auto"/>
+            </w:pPr>
+            <w:r>
+              <w:rPr>
+                <w:sz w:val="17"/>
+              </w:rPr>
+              <w:t>37,0</w:t>
+            </w:r>
+          </w:p>
+        </w:tc>
+        <w:tc>
+          <w:tcPr>
+            <w:tcW w:type="dxa" w:w="887"/>
+          </w:tcPr>
+          <w:p>
+            <w:pPr>
+              <w:spacing w:after="20" w:line="240" w:lineRule="auto"/>
+            </w:pPr>
+            <w:r>
+              <w:rPr>
+                <w:sz w:val="17"/>
+              </w:rPr>
+              <w:t>87,5</w:t>
+            </w:r>
+          </w:p>
+        </w:tc>
+        <w:tc>
+          <w:tcPr>
+            <w:tcW w:type="dxa" w:w="887"/>
+          </w:tcPr>
+          <w:p>
+            <w:pPr>
+              <w:spacing w:after="20" w:line="240" w:lineRule="auto"/>
+            </w:pPr>
+            <w:r>
+              <w:rPr>
+                <w:sz w:val="17"/>
+              </w:rPr>
+              <w:t>137,6</w:t>
+            </w:r>
+          </w:p>
+        </w:tc>
+        <w:tc>
+          <w:tcPr>
+            <w:tcW w:type="dxa" w:w="887"/>
+          </w:tcPr>
+          <w:p>
+            <w:pPr>
+              <w:spacing w:after="20" w:line="240" w:lineRule="auto"/>
+            </w:pPr>
+            <w:r>
+              <w:rPr>
+                <w:sz w:val="17"/>
+              </w:rPr>
+              <w:t>161,4</w:t>
+            </w:r>
+          </w:p>
+        </w:tc>
+        <w:tc>
+          <w:tcPr>
+            <w:tcW w:type="dxa" w:w="887"/>
+          </w:tcPr>
+          <w:p>
+            <w:pPr>
+              <w:spacing w:after="20" w:line="240" w:lineRule="auto"/>
+            </w:pPr>
+            <w:r>
+              <w:rPr>
+                <w:sz w:val="17"/>
+              </w:rPr>
+              <w:t>108,8</w:t>
+            </w:r>
+          </w:p>
+        </w:tc>
+        <w:tc>
+          <w:tcPr>
+            <w:tcW w:type="dxa" w:w="1267"/>
+          </w:tcPr>
+          <w:p>
+            <w:pPr>
+              <w:spacing w:after="20" w:line="240" w:lineRule="auto"/>
+            </w:pPr>
+            <w:r>
+              <w:rPr>
+                <w:sz w:val="17"/>
+              </w:rPr>
+              <w:t>—</w:t>
+            </w:r>
+          </w:p>
+        </w:tc>
+      </w:tr>
+      <w:tr>
+        <w:tc>
+          <w:tcPr>
+            <w:tcW w:type="dxa" w:w="3042"/>
+            <w:shd w:val="clear" w:color="auto" w:fill="F3F6FA"/>
+          </w:tcPr>
+          <w:p>
+            <w:pPr>
+              <w:spacing w:after="20" w:line="240" w:lineRule="auto"/>
+            </w:pPr>
+            <w:r>
+              <w:rPr>
+                <w:sz w:val="17"/>
+              </w:rPr>
+              <w:t>XGBoost</w:t>
+            </w:r>
+          </w:p>
+        </w:tc>
+        <w:tc>
+          <w:tcPr>
+            <w:tcW w:type="dxa" w:w="887"/>
+            <w:shd w:val="clear" w:color="auto" w:fill="F3F6FA"/>
+          </w:tcPr>
+          <w:p>
+            <w:pPr>
+              <w:spacing w:after="20" w:line="240" w:lineRule="auto"/>
+            </w:pPr>
+            <w:r>
+              <w:rPr>
+                <w:sz w:val="17"/>
+              </w:rPr>
+              <w:t>28,1</w:t>
+            </w:r>
+          </w:p>
+        </w:tc>
+        <w:tc>
+          <w:tcPr>
+            <w:tcW w:type="dxa" w:w="887"/>
+            <w:shd w:val="clear" w:color="auto" w:fill="F3F6FA"/>
+          </w:tcPr>
+          <w:p>
+            <w:pPr>
+              <w:spacing w:after="20" w:line="240" w:lineRule="auto"/>
+            </w:pPr>
+            <w:r>
+              <w:rPr>
+                <w:sz w:val="17"/>
+              </w:rPr>
+              <w:t>40,2</w:t>
+            </w:r>
+          </w:p>
+        </w:tc>
+        <w:tc>
+          <w:tcPr>
+            <w:tcW w:type="dxa" w:w="887"/>
+            <w:shd w:val="clear" w:color="auto" w:fill="F3F6FA"/>
+          </w:tcPr>
+          <w:p>
+            <w:pPr>
+              <w:spacing w:after="20" w:line="240" w:lineRule="auto"/>
+            </w:pPr>
+            <w:r>
+              <w:rPr>
+                <w:sz w:val="17"/>
+              </w:rPr>
+              <w:t>99,1</w:t>
+            </w:r>
+          </w:p>
+        </w:tc>
+        <w:tc>
+          <w:tcPr>
+            <w:tcW w:type="dxa" w:w="887"/>
+            <w:shd w:val="clear" w:color="auto" w:fill="F3F6FA"/>
+          </w:tcPr>
+          <w:p>
+            <w:pPr>
+              <w:spacing w:after="20" w:line="240" w:lineRule="auto"/>
+            </w:pPr>
+            <w:r>
+              <w:rPr>
+                <w:sz w:val="17"/>
+              </w:rPr>
+              <w:t>208,2</w:t>
+            </w:r>
+          </w:p>
+        </w:tc>
+        <w:tc>
+          <w:tcPr>
+            <w:tcW w:type="dxa" w:w="887"/>
+            <w:shd w:val="clear" w:color="auto" w:fill="F3F6FA"/>
+          </w:tcPr>
+          <w:p>
+            <w:pPr>
+              <w:spacing w:after="20" w:line="240" w:lineRule="auto"/>
+            </w:pPr>
+            <w:r>
+              <w:rPr>
+                <w:sz w:val="17"/>
+              </w:rPr>
+              <w:t>183,0</w:t>
+            </w:r>
+          </w:p>
+        </w:tc>
+        <w:tc>
+          <w:tcPr>
+            <w:tcW w:type="dxa" w:w="887"/>
+            <w:shd w:val="clear" w:color="auto" w:fill="F3F6FA"/>
+          </w:tcPr>
+          <w:p>
+            <w:pPr>
+              <w:spacing w:after="20" w:line="240" w:lineRule="auto"/>
+            </w:pPr>
+            <w:r>
+              <w:rPr>
+                <w:sz w:val="17"/>
+              </w:rPr>
+              <w:t>102,7</w:t>
+            </w:r>
+          </w:p>
+        </w:tc>
+        <w:tc>
+          <w:tcPr>
+            <w:tcW w:type="dxa" w:w="1267"/>
+            <w:shd w:val="clear" w:color="auto" w:fill="F3F6FA"/>
+          </w:tcPr>
+          <w:p>
+            <w:pPr>
+              <w:spacing w:after="20" w:line="240" w:lineRule="auto"/>
+            </w:pPr>
+            <w:r>
+              <w:rPr>
+                <w:sz w:val="17"/>
+              </w:rPr>
+              <w:t>0 / 3</w:t>
+            </w:r>
+          </w:p>
+        </w:tc>
+      </w:tr>
+      <w:tr>
+        <w:tc>
+          <w:tcPr>
+            <w:tcW w:type="dxa" w:w="3042"/>
+          </w:tcPr>
+          <w:p>
+            <w:pPr>
+              <w:spacing w:after="20" w:line="240" w:lineRule="auto"/>
+            </w:pPr>
+            <w:r>
+              <w:rPr>
+                <w:sz w:val="17"/>
+              </w:rPr>
+              <w:t>ARX+GARCH</w:t>
+            </w:r>
+          </w:p>
+        </w:tc>
+        <w:tc>
+          <w:tcPr>
+            <w:tcW w:type="dxa" w:w="887"/>
+          </w:tcPr>
+          <w:p>
+            <w:pPr>
+              <w:spacing w:after="20" w:line="240" w:lineRule="auto"/>
+            </w:pPr>
+            <w:r>
+              <w:rPr>
+                <w:sz w:val="17"/>
+              </w:rPr>
+              <w:t>221,5</w:t>
+            </w:r>
+          </w:p>
+        </w:tc>
+        <w:tc>
+          <w:tcPr>
+            <w:tcW w:type="dxa" w:w="887"/>
+          </w:tcPr>
+          <w:p>
+            <w:pPr>
+              <w:spacing w:after="20" w:line="240" w:lineRule="auto"/>
+            </w:pPr>
+            <w:r>
+              <w:rPr>
+                <w:sz w:val="17"/>
+              </w:rPr>
+              <w:t>37,0</w:t>
+            </w:r>
+          </w:p>
+        </w:tc>
+        <w:tc>
+          <w:tcPr>
+            <w:tcW w:type="dxa" w:w="887"/>
+          </w:tcPr>
+          <w:p>
+            <w:pPr>
+              <w:spacing w:after="20" w:line="240" w:lineRule="auto"/>
+            </w:pPr>
+            <w:r>
+              <w:rPr>
+                <w:sz w:val="17"/>
+              </w:rPr>
+              <w:t>104,6</w:t>
+            </w:r>
+          </w:p>
+        </w:tc>
+        <w:tc>
+          <w:tcPr>
+            <w:tcW w:type="dxa" w:w="887"/>
+          </w:tcPr>
+          <w:p>
+            <w:pPr>
+              <w:spacing w:after="20" w:line="240" w:lineRule="auto"/>
+            </w:pPr>
+            <w:r>
+              <w:rPr>
+                <w:sz w:val="17"/>
+              </w:rPr>
+              <w:t>147,9</w:t>
+            </w:r>
+          </w:p>
+        </w:tc>
+        <w:tc>
+          <w:tcPr>
+            <w:tcW w:type="dxa" w:w="887"/>
+          </w:tcPr>
+          <w:p>
+            <w:pPr>
+              <w:spacing w:after="20" w:line="240" w:lineRule="auto"/>
+            </w:pPr>
+            <w:r>
+              <w:rPr>
+                <w:sz w:val="17"/>
+              </w:rPr>
+              <w:t>157,8</w:t>
+            </w:r>
+          </w:p>
+        </w:tc>
+        <w:tc>
+          <w:tcPr>
+            <w:tcW w:type="dxa" w:w="887"/>
+          </w:tcPr>
+          <w:p>
+            <w:pPr>
+              <w:spacing w:after="20" w:line="240" w:lineRule="auto"/>
+            </w:pPr>
+            <w:r>
+              <w:rPr>
+                <w:sz w:val="17"/>
+              </w:rPr>
+              <w:t>105,0</w:t>
+            </w:r>
+          </w:p>
+        </w:tc>
+        <w:tc>
+          <w:tcPr>
+            <w:tcW w:type="dxa" w:w="1267"/>
+          </w:tcPr>
+          <w:p>
+            <w:pPr>
+              <w:spacing w:after="20" w:line="240" w:lineRule="auto"/>
+            </w:pPr>
+            <w:r>
+              <w:rPr>
+                <w:sz w:val="17"/>
+              </w:rPr>
+              <w:t>0 / 3</w:t>
+            </w:r>
+          </w:p>
+        </w:tc>
+      </w:tr>
+      <w:tr>
+        <w:tc>
+          <w:tcPr>
+            <w:tcW w:type="dxa" w:w="3042"/>
+            <w:shd w:val="clear" w:color="auto" w:fill="F3F6FA"/>
+          </w:tcPr>
+          <w:p>
+            <w:pPr>
+              <w:spacing w:after="20" w:line="240" w:lineRule="auto"/>
+            </w:pPr>
+            <w:r>
+              <w:rPr>
+                <w:sz w:val="17"/>
+              </w:rPr>
+              <w:t>GARCH-ged</w:t>
+            </w:r>
+          </w:p>
+        </w:tc>
+        <w:tc>
+          <w:tcPr>
+            <w:tcW w:type="dxa" w:w="887"/>
+            <w:shd w:val="clear" w:color="auto" w:fill="F3F6FA"/>
+          </w:tcPr>
+          <w:p>
+            <w:pPr>
+              <w:spacing w:after="20" w:line="240" w:lineRule="auto"/>
+            </w:pPr>
+            <w:r>
+              <w:rPr>
+                <w:sz w:val="17"/>
+              </w:rPr>
+              <w:t>30,4</w:t>
+            </w:r>
+          </w:p>
+        </w:tc>
+        <w:tc>
+          <w:tcPr>
+            <w:tcW w:type="dxa" w:w="887"/>
+            <w:shd w:val="clear" w:color="auto" w:fill="F3F6FA"/>
+          </w:tcPr>
+          <w:p>
+            <w:pPr>
+              <w:spacing w:after="20" w:line="240" w:lineRule="auto"/>
+            </w:pPr>
+            <w:r>
+              <w:rPr>
+                <w:sz w:val="17"/>
+              </w:rPr>
+              <w:t>35,9</w:t>
+            </w:r>
+          </w:p>
+        </w:tc>
+        <w:tc>
+          <w:tcPr>
+            <w:tcW w:type="dxa" w:w="887"/>
+            <w:shd w:val="clear" w:color="auto" w:fill="F3F6FA"/>
+          </w:tcPr>
+          <w:p>
+            <w:pPr>
+              <w:spacing w:after="20" w:line="240" w:lineRule="auto"/>
+            </w:pPr>
+            <w:r>
+              <w:rPr>
+                <w:sz w:val="17"/>
+              </w:rPr>
+              <w:t>81,3</w:t>
+            </w:r>
+          </w:p>
+        </w:tc>
+        <w:tc>
+          <w:tcPr>
+            <w:tcW w:type="dxa" w:w="887"/>
+            <w:shd w:val="clear" w:color="auto" w:fill="F3F6FA"/>
+          </w:tcPr>
+          <w:p>
+            <w:pPr>
+              <w:spacing w:after="20" w:line="240" w:lineRule="auto"/>
+            </w:pPr>
+            <w:r>
+              <w:rPr>
+                <w:sz w:val="17"/>
+              </w:rPr>
+              <w:t>139,3</w:t>
+            </w:r>
+          </w:p>
+        </w:tc>
+        <w:tc>
+          <w:tcPr>
+            <w:tcW w:type="dxa" w:w="887"/>
+            <w:shd w:val="clear" w:color="auto" w:fill="F3F6FA"/>
+          </w:tcPr>
+          <w:p>
+            <w:pPr>
+              <w:spacing w:after="20" w:line="240" w:lineRule="auto"/>
+            </w:pPr>
+            <w:r>
+              <w:rPr>
+                <w:sz w:val="17"/>
+              </w:rPr>
+              <w:t>148,6</w:t>
+            </w:r>
+          </w:p>
+        </w:tc>
+        <w:tc>
+          <w:tcPr>
+            <w:tcW w:type="dxa" w:w="887"/>
+            <w:shd w:val="clear" w:color="auto" w:fill="F3F6FA"/>
+          </w:tcPr>
+          <w:p>
+            <w:pPr>
+              <w:spacing w:after="20" w:line="240" w:lineRule="auto"/>
+            </w:pPr>
+            <w:r>
+              <w:rPr>
+                <w:sz w:val="17"/>
+              </w:rPr>
+              <w:t>100,6</w:t>
+            </w:r>
+          </w:p>
+        </w:tc>
+        <w:tc>
+          <w:tcPr>
+            <w:tcW w:type="dxa" w:w="1267"/>
+            <w:shd w:val="clear" w:color="auto" w:fill="F3F6FA"/>
+          </w:tcPr>
+          <w:p>
+            <w:pPr>
+              <w:spacing w:after="20" w:line="240" w:lineRule="auto"/>
+            </w:pPr>
+            <w:r>
+              <w:rPr>
+                <w:sz w:val="17"/>
+              </w:rPr>
+              <w:t>3 / 1</w:t>
+            </w:r>
+          </w:p>
+        </w:tc>
+      </w:tr>
+      <w:tr>
+        <w:tc>
+          <w:tcPr>
+            <w:tcW w:type="dxa" w:w="3042"/>
+          </w:tcPr>
+          <w:p>
+            <w:pPr>
+              <w:spacing w:after="20" w:line="240" w:lineRule="auto"/>
+            </w:pPr>
+            <w:r>
+              <w:rPr>
+                <w:sz w:val="17"/>
+              </w:rPr>
+              <w:t>N-BEATSx</w:t>
+            </w:r>
+          </w:p>
+        </w:tc>
+        <w:tc>
+          <w:tcPr>
+            <w:tcW w:type="dxa" w:w="887"/>
+          </w:tcPr>
+          <w:p>
+            <w:pPr>
+              <w:spacing w:after="20" w:line="240" w:lineRule="auto"/>
+            </w:pPr>
+            <w:r>
+              <w:rPr>
+                <w:sz w:val="17"/>
+              </w:rPr>
+              <w:t>95,2</w:t>
+            </w:r>
+          </w:p>
+        </w:tc>
+        <w:tc>
+          <w:tcPr>
+            <w:tcW w:type="dxa" w:w="887"/>
+          </w:tcPr>
+          <w:p>
+            <w:pPr>
+              <w:spacing w:after="20" w:line="240" w:lineRule="auto"/>
+            </w:pPr>
+            <w:r>
+              <w:rPr>
+                <w:sz w:val="17"/>
+              </w:rPr>
+              <w:t>40,6</w:t>
+            </w:r>
+          </w:p>
+        </w:tc>
+        <w:tc>
+          <w:tcPr>
+            <w:tcW w:type="dxa" w:w="887"/>
+          </w:tcPr>
+          <w:p>
+            <w:pPr>
+              <w:spacing w:after="20" w:line="240" w:lineRule="auto"/>
+            </w:pPr>
+            <w:r>
+              <w:rPr>
+                <w:sz w:val="17"/>
+              </w:rPr>
+              <w:t>88,9</w:t>
+            </w:r>
+          </w:p>
+        </w:tc>
+        <w:tc>
+          <w:tcPr>
+            <w:tcW w:type="dxa" w:w="887"/>
+          </w:tcPr>
+          <w:p>
+            <w:pPr>
+              <w:spacing w:after="20" w:line="240" w:lineRule="auto"/>
+            </w:pPr>
+            <w:r>
+              <w:rPr>
+                <w:sz w:val="17"/>
+              </w:rPr>
+              <w:t>148,1</w:t>
+            </w:r>
+          </w:p>
+        </w:tc>
+        <w:tc>
+          <w:tcPr>
+            <w:tcW w:type="dxa" w:w="887"/>
+          </w:tcPr>
+          <w:p>
+            <w:pPr>
+              <w:spacing w:after="20" w:line="240" w:lineRule="auto"/>
+            </w:pPr>
+            <w:r>
+              <w:rPr>
+                <w:sz w:val="17"/>
+              </w:rPr>
+              <w:t>184,2</w:t>
+            </w:r>
+          </w:p>
+        </w:tc>
+        <w:tc>
+          <w:tcPr>
+            <w:tcW w:type="dxa" w:w="887"/>
+          </w:tcPr>
+          <w:p>
+            <w:pPr>
+              <w:spacing w:after="20" w:line="240" w:lineRule="auto"/>
+            </w:pPr>
+            <w:r>
+              <w:rPr>
+                <w:sz w:val="17"/>
+              </w:rPr>
+              <w:t>101,7</w:t>
+            </w:r>
+          </w:p>
+        </w:tc>
+        <w:tc>
+          <w:tcPr>
+            <w:tcW w:type="dxa" w:w="1267"/>
+          </w:tcPr>
+          <w:p>
+            <w:pPr>
+              <w:spacing w:after="20" w:line="240" w:lineRule="auto"/>
+            </w:pPr>
+            <w:r>
+              <w:rPr>
+                <w:sz w:val="17"/>
+              </w:rPr>
+              <w:t>0 / 4</w:t>
+            </w:r>
+          </w:p>
+        </w:tc>
+      </w:tr>
+      <w:tr>
+        <w:tc>
+          <w:tcPr>
+            <w:tcW w:type="dxa" w:w="3042"/>
+            <w:shd w:val="clear" w:color="auto" w:fill="F3F6FA"/>
+          </w:tcPr>
+          <w:p>
+            <w:pPr>
+              <w:spacing w:after="20" w:line="240" w:lineRule="auto"/>
+            </w:pPr>
+            <w:r>
+              <w:rPr>
+                <w:sz w:val="17"/>
+              </w:rPr>
+              <w:t>N-HiTS</w:t>
+            </w:r>
+          </w:p>
+        </w:tc>
+        <w:tc>
+          <w:tcPr>
+            <w:tcW w:type="dxa" w:w="887"/>
+            <w:shd w:val="clear" w:color="auto" w:fill="F3F6FA"/>
+          </w:tcPr>
+          <w:p>
+            <w:pPr>
+              <w:spacing w:after="20" w:line="240" w:lineRule="auto"/>
+            </w:pPr>
+            <w:r>
+              <w:rPr>
+                <w:sz w:val="17"/>
+              </w:rPr>
+              <w:t>125,3</w:t>
+            </w:r>
+          </w:p>
+        </w:tc>
+        <w:tc>
+          <w:tcPr>
+            <w:tcW w:type="dxa" w:w="887"/>
+            <w:shd w:val="clear" w:color="auto" w:fill="F3F6FA"/>
+          </w:tcPr>
+          <w:p>
+            <w:pPr>
+              <w:spacing w:after="20" w:line="240" w:lineRule="auto"/>
+            </w:pPr>
+            <w:r>
+              <w:rPr>
+                <w:sz w:val="17"/>
+              </w:rPr>
+              <w:t>38,0</w:t>
+            </w:r>
+          </w:p>
+        </w:tc>
+        <w:tc>
+          <w:tcPr>
+            <w:tcW w:type="dxa" w:w="887"/>
+            <w:shd w:val="clear" w:color="auto" w:fill="F3F6FA"/>
+          </w:tcPr>
+          <w:p>
+            <w:pPr>
+              <w:spacing w:after="20" w:line="240" w:lineRule="auto"/>
+            </w:pPr>
+            <w:r>
+              <w:rPr>
+                <w:sz w:val="17"/>
+              </w:rPr>
+              <w:t>85,2</w:t>
+            </w:r>
+          </w:p>
+        </w:tc>
+        <w:tc>
+          <w:tcPr>
+            <w:tcW w:type="dxa" w:w="887"/>
+            <w:shd w:val="clear" w:color="auto" w:fill="F3F6FA"/>
+          </w:tcPr>
+          <w:p>
+            <w:pPr>
+              <w:spacing w:after="20" w:line="240" w:lineRule="auto"/>
+            </w:pPr>
+            <w:r>
+              <w:rPr>
+                <w:sz w:val="17"/>
+              </w:rPr>
+              <w:t>151,5</w:t>
+            </w:r>
+          </w:p>
+        </w:tc>
+        <w:tc>
+          <w:tcPr>
+            <w:tcW w:type="dxa" w:w="887"/>
+            <w:shd w:val="clear" w:color="auto" w:fill="F3F6FA"/>
+          </w:tcPr>
+          <w:p>
+            <w:pPr>
+              <w:spacing w:after="20" w:line="240" w:lineRule="auto"/>
+            </w:pPr>
+            <w:r>
+              <w:rPr>
+                <w:sz w:val="17"/>
+              </w:rPr>
+              <w:t>169,0</w:t>
+            </w:r>
+          </w:p>
+        </w:tc>
+        <w:tc>
+          <w:tcPr>
+            <w:tcW w:type="dxa" w:w="887"/>
+            <w:shd w:val="clear" w:color="auto" w:fill="F3F6FA"/>
+          </w:tcPr>
+          <w:p>
+            <w:pPr>
+              <w:spacing w:after="20" w:line="240" w:lineRule="auto"/>
+            </w:pPr>
+            <w:r>
+              <w:rPr>
+                <w:sz w:val="17"/>
+              </w:rPr>
+              <w:t>115,7</w:t>
+            </w:r>
+          </w:p>
+        </w:tc>
+        <w:tc>
+          <w:tcPr>
+            <w:tcW w:type="dxa" w:w="1267"/>
+            <w:shd w:val="clear" w:color="auto" w:fill="F3F6FA"/>
+          </w:tcPr>
+          <w:p>
+            <w:pPr>
+              <w:spacing w:after="20" w:line="240" w:lineRule="auto"/>
+            </w:pPr>
+            <w:r>
+              <w:rPr>
+                <w:sz w:val="17"/>
+              </w:rPr>
+              <w:t>0 / 2</w:t>
+            </w:r>
+          </w:p>
+        </w:tc>
+      </w:tr>
+      <w:tr>
+        <w:tc>
+          <w:tcPr>
+            <w:tcW w:type="dxa" w:w="3042"/>
+          </w:tcPr>
+          <w:p>
+            <w:pPr>
+              <w:spacing w:after="20" w:line="240" w:lineRule="auto"/>
+            </w:pPr>
+            <w:r>
+              <w:rPr>
+                <w:sz w:val="17"/>
+              </w:rPr>
+              <w:t>Predespacho de XM solo</w:t>
+            </w:r>
+          </w:p>
+        </w:tc>
+        <w:tc>
+          <w:tcPr>
+            <w:tcW w:type="dxa" w:w="887"/>
+          </w:tcPr>
+          <w:p>
+            <w:pPr>
+              <w:spacing w:after="20" w:line="240" w:lineRule="auto"/>
+            </w:pPr>
+            <w:r>
+              <w:rPr>
+                <w:sz w:val="17"/>
+              </w:rPr>
+              <w:t>13,6</w:t>
+            </w:r>
+          </w:p>
+        </w:tc>
+        <w:tc>
+          <w:tcPr>
+            <w:tcW w:type="dxa" w:w="887"/>
+          </w:tcPr>
+          <w:p>
+            <w:pPr>
+              <w:spacing w:after="20" w:line="240" w:lineRule="auto"/>
+            </w:pPr>
+            <w:r>
+              <w:rPr>
+                <w:sz w:val="17"/>
+              </w:rPr>
+              <w:t>12,5</w:t>
+            </w:r>
+          </w:p>
+        </w:tc>
+        <w:tc>
+          <w:tcPr>
+            <w:tcW w:type="dxa" w:w="887"/>
+          </w:tcPr>
+          <w:p>
+            <w:pPr>
+              <w:spacing w:after="20" w:line="240" w:lineRule="auto"/>
+            </w:pPr>
+            <w:r>
+              <w:rPr>
+                <w:sz w:val="17"/>
+              </w:rPr>
+              <w:t>23,5</w:t>
+            </w:r>
+          </w:p>
+        </w:tc>
+        <w:tc>
+          <w:tcPr>
+            <w:tcW w:type="dxa" w:w="887"/>
+          </w:tcPr>
+          <w:p>
+            <w:pPr>
+              <w:spacing w:after="20" w:line="240" w:lineRule="auto"/>
+            </w:pPr>
+            <w:r>
+              <w:rPr>
+                <w:sz w:val="17"/>
+              </w:rPr>
+              <w:t>37,0</w:t>
+            </w:r>
+          </w:p>
+        </w:tc>
+        <w:tc>
+          <w:tcPr>
+            <w:tcW w:type="dxa" w:w="887"/>
+          </w:tcPr>
+          <w:p>
+            <w:pPr>
+              <w:spacing w:after="20" w:line="240" w:lineRule="auto"/>
+            </w:pPr>
+            <w:r>
+              <w:rPr>
+                <w:sz w:val="17"/>
+              </w:rPr>
+              <w:t>59,5</w:t>
+            </w:r>
+          </w:p>
+        </w:tc>
+        <w:tc>
+          <w:tcPr>
+            <w:tcW w:type="dxa" w:w="887"/>
+          </w:tcPr>
+          <w:p>
+            <w:pPr>
+              <w:spacing w:after="20" w:line="240" w:lineRule="auto"/>
+            </w:pPr>
+            <w:r>
+              <w:rPr>
+                <w:sz w:val="17"/>
+              </w:rPr>
+              <w:t>39,2</w:t>
+            </w:r>
+          </w:p>
+        </w:tc>
+        <w:tc>
+          <w:tcPr>
+            <w:tcW w:type="dxa" w:w="1267"/>
+          </w:tcPr>
+          <w:p>
+            <w:pPr>
+              <w:spacing w:after="20" w:line="240" w:lineRule="auto"/>
+            </w:pPr>
+            <w:r>
+              <w:rPr>
+                <w:sz w:val="17"/>
+              </w:rPr>
+              <w:t>6 / 0</w:t>
+            </w:r>
+          </w:p>
+        </w:tc>
+      </w:tr>
+      <w:tr>
+        <w:tc>
+          <w:tcPr>
+            <w:tcW w:type="dxa" w:w="3042"/>
+            <w:shd w:val="clear" w:color="auto" w:fill="F3F6FA"/>
+          </w:tcPr>
+          <w:p>
+            <w:pPr>
+              <w:spacing w:after="20" w:line="240" w:lineRule="auto"/>
+            </w:pPr>
+            <w:r>
+              <w:rPr>
+                <w:sz w:val="17"/>
+              </w:rPr>
+              <w:t>Predespacho + CatBoost (Augur)</w:t>
+            </w:r>
+          </w:p>
+        </w:tc>
+        <w:tc>
+          <w:tcPr>
+            <w:tcW w:type="dxa" w:w="887"/>
+            <w:shd w:val="clear" w:color="auto" w:fill="F3F6FA"/>
+          </w:tcPr>
+          <w:p>
+            <w:pPr>
+              <w:spacing w:after="20" w:line="240" w:lineRule="auto"/>
+            </w:pPr>
+            <w:r>
+              <w:rPr>
+                <w:sz w:val="17"/>
+              </w:rPr>
+              <w:t>9,3</w:t>
+            </w:r>
+          </w:p>
+        </w:tc>
+        <w:tc>
+          <w:tcPr>
+            <w:tcW w:type="dxa" w:w="887"/>
+            <w:shd w:val="clear" w:color="auto" w:fill="F3F6FA"/>
+          </w:tcPr>
+          <w:p>
+            <w:pPr>
+              <w:spacing w:after="20" w:line="240" w:lineRule="auto"/>
+            </w:pPr>
+            <w:r>
+              <w:rPr>
+                <w:sz w:val="17"/>
+              </w:rPr>
+              <w:t>12,0</w:t>
+            </w:r>
+          </w:p>
+        </w:tc>
+        <w:tc>
+          <w:tcPr>
+            <w:tcW w:type="dxa" w:w="887"/>
+            <w:shd w:val="clear" w:color="auto" w:fill="F3F6FA"/>
+          </w:tcPr>
+          <w:p>
+            <w:pPr>
+              <w:spacing w:after="20" w:line="240" w:lineRule="auto"/>
+            </w:pPr>
+            <w:r>
+              <w:rPr>
+                <w:sz w:val="17"/>
+              </w:rPr>
+              <w:t>21,2</w:t>
+            </w:r>
+          </w:p>
+        </w:tc>
+        <w:tc>
+          <w:tcPr>
+            <w:tcW w:type="dxa" w:w="887"/>
+            <w:shd w:val="clear" w:color="auto" w:fill="F3F6FA"/>
+          </w:tcPr>
+          <w:p>
+            <w:pPr>
+              <w:spacing w:after="20" w:line="240" w:lineRule="auto"/>
+            </w:pPr>
+            <w:r>
+              <w:rPr>
+                <w:sz w:val="17"/>
+              </w:rPr>
+              <w:t>36,3</w:t>
+            </w:r>
+          </w:p>
+        </w:tc>
+        <w:tc>
+          <w:tcPr>
+            <w:tcW w:type="dxa" w:w="887"/>
+            <w:shd w:val="clear" w:color="auto" w:fill="F3F6FA"/>
+          </w:tcPr>
+          <w:p>
+            <w:pPr>
+              <w:spacing w:after="20" w:line="240" w:lineRule="auto"/>
+            </w:pPr>
+            <w:r>
+              <w:rPr>
+                <w:sz w:val="17"/>
+              </w:rPr>
+              <w:t>56,7</w:t>
+            </w:r>
+          </w:p>
+        </w:tc>
+        <w:tc>
+          <w:tcPr>
+            <w:tcW w:type="dxa" w:w="887"/>
+            <w:shd w:val="clear" w:color="auto" w:fill="F3F6FA"/>
+          </w:tcPr>
+          <w:p>
+            <w:pPr>
+              <w:spacing w:after="20" w:line="240" w:lineRule="auto"/>
+            </w:pPr>
+            <w:r>
+              <w:rPr>
+                <w:sz w:val="17"/>
+              </w:rPr>
+              <w:t>35,2</w:t>
+            </w:r>
+          </w:p>
+        </w:tc>
+        <w:tc>
+          <w:tcPr>
+            <w:tcW w:type="dxa" w:w="1267"/>
+            <w:shd w:val="clear" w:color="auto" w:fill="F3F6FA"/>
+          </w:tcPr>
+          <w:p>
+            <w:pPr>
+              <w:spacing w:after="20" w:line="240" w:lineRule="auto"/>
+            </w:pPr>
+            <w:r>
+              <w:rPr>
+                <w:sz w:val="17"/>
+              </w:rPr>
+              <w:t>6 / 0</w:t>
+            </w:r>
+          </w:p>
+        </w:tc>
+      </w:tr>
+    </w:tbl>
+    <w:p>
+      <w:r>
+        <w:rPr>
+          <w:color w:val="595959"/>
+          <w:sz w:val="17"/>
+        </w:rPr>
+        <w:t>2026 = 15 de enero a 5 de agosto. Sin el precio de ayer, ningún modelo que pronostica el precio desde cero supera de forma consistente a la persistencia; el predespacho solo los supera a todos, y corregirlo lo mejora en 5 de 6 periodos. En 2020-21, ARX+GARCH y las redes se entrenan con solo 17 meses y quedan fijos todo el año, por eso su error es tan alto.</w:t>
+      </w:r>
+    </w:p>
+    <w:p>
+      <w:pPr>
+        <w:keepNext/>
+        <w:spacing w:after="60"/>
+      </w:pPr>
+      <w:r>
+        <w:rPr>
+          <w:b/>
+          <w:color w:val="1F4E79"/>
+          <w:sz w:val="20"/>
+        </w:rPr>
+        <w:t>Tabla 23. Detector de eventos por día del horizonte: mejora sobre la climatología (BSS)</w:t>
+      </w:r>
+    </w:p>
+    <w:tbl>
+      <w:tblPr>
+        <w:tblStyle w:val="TableGrid"/>
+        <w:tblW w:type="auto" w:w="0"/>
+        <w:jc w:val="center"/>
+        <w:tblLook w:firstColumn="1" w:firstRow="1" w:lastColumn="0" w:lastRow="0" w:noHBand="0" w:noVBand="1" w:val="04A0"/>
+      </w:tblPr>
+      <w:tblGrid>
+        <w:gridCol w:w="1376"/>
+        <w:gridCol w:w="1376"/>
+        <w:gridCol w:w="1376"/>
+        <w:gridCol w:w="1376"/>
+        <w:gridCol w:w="1376"/>
+        <w:gridCol w:w="1376"/>
+        <w:gridCol w:w="1376"/>
+      </w:tblGrid>
+      <w:tr>
+        <w:trPr>
+          <w:tblHeader w:val="true"/>
+        </w:trPr>
+        <w:tc>
+          <w:tcPr>
+            <w:tcW w:type="dxa" w:w="2657"/>
+            <w:shd w:val="clear" w:color="auto" w:fill="1F4E79"/>
+          </w:tcPr>
+          <w:p>
+            <w:pPr>
+              <w:spacing w:after="20" w:line="240" w:lineRule="auto"/>
+            </w:pPr>
+            <w:r>
+              <w:rPr>
+                <w:b/>
+                <w:color w:val="FFFFFF"/>
+                <w:sz w:val="17"/>
+              </w:rPr>
+              <w:t>Evento y día</w:t>
+            </w:r>
+          </w:p>
+        </w:tc>
+        <w:tc>
+          <w:tcPr>
+            <w:tcW w:type="dxa" w:w="1162"/>
+            <w:shd w:val="clear" w:color="auto" w:fill="1F4E79"/>
+          </w:tcPr>
+          <w:p>
+            <w:pPr>
+              <w:spacing w:after="20" w:line="240" w:lineRule="auto"/>
+            </w:pPr>
+            <w:r>
+              <w:rPr>
+                <w:b/>
+                <w:color w:val="FFFFFF"/>
+                <w:sz w:val="17"/>
+              </w:rPr>
+              <w:t>2020-21</w:t>
+            </w:r>
+          </w:p>
+        </w:tc>
+        <w:tc>
+          <w:tcPr>
+            <w:tcW w:type="dxa" w:w="1162"/>
+            <w:shd w:val="clear" w:color="auto" w:fill="1F4E79"/>
+          </w:tcPr>
+          <w:p>
+            <w:pPr>
+              <w:spacing w:after="20" w:line="240" w:lineRule="auto"/>
+            </w:pPr>
+            <w:r>
+              <w:rPr>
+                <w:b/>
+                <w:color w:val="FFFFFF"/>
+                <w:sz w:val="17"/>
+              </w:rPr>
+              <w:t>2021-22</w:t>
+            </w:r>
+          </w:p>
+        </w:tc>
+        <w:tc>
+          <w:tcPr>
+            <w:tcW w:type="dxa" w:w="1162"/>
+            <w:shd w:val="clear" w:color="auto" w:fill="1F4E79"/>
+          </w:tcPr>
+          <w:p>
+            <w:pPr>
+              <w:spacing w:after="20" w:line="240" w:lineRule="auto"/>
+            </w:pPr>
+            <w:r>
+              <w:rPr>
+                <w:b/>
+                <w:color w:val="FFFFFF"/>
+                <w:sz w:val="17"/>
+              </w:rPr>
+              <w:t>2022-23</w:t>
+            </w:r>
+          </w:p>
+        </w:tc>
+        <w:tc>
+          <w:tcPr>
+            <w:tcW w:type="dxa" w:w="1162"/>
+            <w:shd w:val="clear" w:color="auto" w:fill="1F4E79"/>
+          </w:tcPr>
+          <w:p>
+            <w:pPr>
+              <w:spacing w:after="20" w:line="240" w:lineRule="auto"/>
+            </w:pPr>
+            <w:r>
+              <w:rPr>
+                <w:b/>
+                <w:color w:val="FFFFFF"/>
+                <w:sz w:val="17"/>
+              </w:rPr>
+              <w:t>2023-24</w:t>
+            </w:r>
+          </w:p>
+        </w:tc>
+        <w:tc>
+          <w:tcPr>
+            <w:tcW w:type="dxa" w:w="1162"/>
+            <w:shd w:val="clear" w:color="auto" w:fill="1F4E79"/>
+          </w:tcPr>
+          <w:p>
+            <w:pPr>
+              <w:spacing w:after="20" w:line="240" w:lineRule="auto"/>
+            </w:pPr>
+            <w:r>
+              <w:rPr>
+                <w:b/>
+                <w:color w:val="FFFFFF"/>
+                <w:sz w:val="17"/>
+              </w:rPr>
+              <w:t>2024-25</w:t>
+            </w:r>
+          </w:p>
+        </w:tc>
+        <w:tc>
+          <w:tcPr>
+            <w:tcW w:type="dxa" w:w="1162"/>
+            <w:shd w:val="clear" w:color="auto" w:fill="1F4E79"/>
+          </w:tcPr>
+          <w:p>
+            <w:pPr>
+              <w:spacing w:after="20" w:line="240" w:lineRule="auto"/>
+            </w:pPr>
+            <w:r>
+              <w:rPr>
+                <w:b/>
+                <w:color w:val="FFFFFF"/>
+                <w:sz w:val="17"/>
+              </w:rPr>
+              <w:t>2026</w:t>
+            </w:r>
+          </w:p>
+        </w:tc>
+      </w:tr>
+      <w:tr>
+        <w:tc>
+          <w:tcPr>
+            <w:tcW w:type="dxa" w:w="2657"/>
+          </w:tcPr>
+          <w:p>
+            <w:pPr>
+              <w:spacing w:after="20" w:line="240" w:lineRule="auto"/>
+            </w:pPr>
+            <w:r>
+              <w:rPr>
+                <w:sz w:val="17"/>
+              </w:rPr>
+              <w:t>Pico · Día 1</w:t>
+            </w:r>
+          </w:p>
+        </w:tc>
+        <w:tc>
+          <w:tcPr>
+            <w:tcW w:type="dxa" w:w="1162"/>
+          </w:tcPr>
+          <w:p>
+            <w:pPr>
+              <w:spacing w:after="20" w:line="240" w:lineRule="auto"/>
+            </w:pPr>
+            <w:r>
+              <w:rPr>
+                <w:sz w:val="17"/>
+              </w:rPr>
+              <w:t>0,23*</w:t>
+            </w:r>
+          </w:p>
+        </w:tc>
+        <w:tc>
+          <w:tcPr>
+            <w:tcW w:type="dxa" w:w="1162"/>
+          </w:tcPr>
+          <w:p>
+            <w:pPr>
+              <w:spacing w:after="20" w:line="240" w:lineRule="auto"/>
+            </w:pPr>
+            <w:r>
+              <w:rPr>
+                <w:sz w:val="17"/>
+              </w:rPr>
+              <w:t>0,16*</w:t>
+            </w:r>
+          </w:p>
+        </w:tc>
+        <w:tc>
+          <w:tcPr>
+            <w:tcW w:type="dxa" w:w="1162"/>
+          </w:tcPr>
+          <w:p>
+            <w:pPr>
+              <w:spacing w:after="20" w:line="240" w:lineRule="auto"/>
+            </w:pPr>
+            <w:r>
+              <w:rPr>
+                <w:sz w:val="17"/>
+              </w:rPr>
+              <w:t>0,29*</w:t>
+            </w:r>
+          </w:p>
+        </w:tc>
+        <w:tc>
+          <w:tcPr>
+            <w:tcW w:type="dxa" w:w="1162"/>
+          </w:tcPr>
+          <w:p>
+            <w:pPr>
+              <w:spacing w:after="20" w:line="240" w:lineRule="auto"/>
+            </w:pPr>
+            <w:r>
+              <w:rPr>
+                <w:sz w:val="17"/>
+              </w:rPr>
+              <w:t>0,37*</w:t>
+            </w:r>
+          </w:p>
+        </w:tc>
+        <w:tc>
+          <w:tcPr>
+            <w:tcW w:type="dxa" w:w="1162"/>
+          </w:tcPr>
+          <w:p>
+            <w:pPr>
+              <w:spacing w:after="20" w:line="240" w:lineRule="auto"/>
+            </w:pPr>
+            <w:r>
+              <w:rPr>
+                <w:sz w:val="17"/>
+              </w:rPr>
+              <w:t>0,41*</w:t>
+            </w:r>
+          </w:p>
+        </w:tc>
+        <w:tc>
+          <w:tcPr>
+            <w:tcW w:type="dxa" w:w="1162"/>
+          </w:tcPr>
+          <w:p>
+            <w:pPr>
+              <w:spacing w:after="20" w:line="240" w:lineRule="auto"/>
+            </w:pPr>
+            <w:r>
+              <w:rPr>
+                <w:sz w:val="17"/>
+              </w:rPr>
+              <w:t>0,55*</w:t>
+            </w:r>
+          </w:p>
+        </w:tc>
+      </w:tr>
+      <w:tr>
+        <w:tc>
+          <w:tcPr>
+            <w:tcW w:type="dxa" w:w="2657"/>
+            <w:shd w:val="clear" w:color="auto" w:fill="F3F6FA"/>
+          </w:tcPr>
+          <w:p>
+            <w:pPr>
+              <w:spacing w:after="20" w:line="240" w:lineRule="auto"/>
+            </w:pPr>
+            <w:r>
+              <w:rPr>
+                <w:sz w:val="17"/>
+              </w:rPr>
+              <w:t>Pico · Día 2</w:t>
+            </w:r>
+          </w:p>
+        </w:tc>
+        <w:tc>
+          <w:tcPr>
+            <w:tcW w:type="dxa" w:w="1162"/>
+            <w:shd w:val="clear" w:color="auto" w:fill="F3F6FA"/>
+          </w:tcPr>
+          <w:p>
+            <w:pPr>
+              <w:spacing w:after="20" w:line="240" w:lineRule="auto"/>
+            </w:pPr>
+            <w:r>
+              <w:rPr>
+                <w:sz w:val="17"/>
+              </w:rPr>
+              <w:t>−0,01</w:t>
+            </w:r>
+          </w:p>
+        </w:tc>
+        <w:tc>
+          <w:tcPr>
+            <w:tcW w:type="dxa" w:w="1162"/>
+            <w:shd w:val="clear" w:color="auto" w:fill="F3F6FA"/>
+          </w:tcPr>
+          <w:p>
+            <w:pPr>
+              <w:spacing w:after="20" w:line="240" w:lineRule="auto"/>
+            </w:pPr>
+            <w:r>
+              <w:rPr>
+                <w:sz w:val="17"/>
+              </w:rPr>
+              <w:t>−0,09</w:t>
+            </w:r>
+          </w:p>
+        </w:tc>
+        <w:tc>
+          <w:tcPr>
+            <w:tcW w:type="dxa" w:w="1162"/>
+            <w:shd w:val="clear" w:color="auto" w:fill="F3F6FA"/>
+          </w:tcPr>
+          <w:p>
+            <w:pPr>
+              <w:spacing w:after="20" w:line="240" w:lineRule="auto"/>
+            </w:pPr>
+            <w:r>
+              <w:rPr>
+                <w:sz w:val="17"/>
+              </w:rPr>
+              <w:t>0,01</w:t>
+            </w:r>
+          </w:p>
+        </w:tc>
+        <w:tc>
+          <w:tcPr>
+            <w:tcW w:type="dxa" w:w="1162"/>
+            <w:shd w:val="clear" w:color="auto" w:fill="F3F6FA"/>
+          </w:tcPr>
+          <w:p>
+            <w:pPr>
+              <w:spacing w:after="20" w:line="240" w:lineRule="auto"/>
+            </w:pPr>
+            <w:r>
+              <w:rPr>
+                <w:sz w:val="17"/>
+              </w:rPr>
+              <w:t>0,19*</w:t>
+            </w:r>
+          </w:p>
+        </w:tc>
+        <w:tc>
+          <w:tcPr>
+            <w:tcW w:type="dxa" w:w="1162"/>
+            <w:shd w:val="clear" w:color="auto" w:fill="F3F6FA"/>
+          </w:tcPr>
+          <w:p>
+            <w:pPr>
+              <w:spacing w:after="20" w:line="240" w:lineRule="auto"/>
+            </w:pPr>
+            <w:r>
+              <w:rPr>
+                <w:sz w:val="17"/>
+              </w:rPr>
+              <w:t>0,19*</w:t>
+            </w:r>
+          </w:p>
+        </w:tc>
+        <w:tc>
+          <w:tcPr>
+            <w:tcW w:type="dxa" w:w="1162"/>
+            <w:shd w:val="clear" w:color="auto" w:fill="F3F6FA"/>
+          </w:tcPr>
+          <w:p>
+            <w:pPr>
+              <w:spacing w:after="20" w:line="240" w:lineRule="auto"/>
+            </w:pPr>
+            <w:r>
+              <w:rPr>
+                <w:sz w:val="17"/>
+              </w:rPr>
+              <w:t>0,33*</w:t>
+            </w:r>
+          </w:p>
+        </w:tc>
+      </w:tr>
+      <w:tr>
+        <w:tc>
+          <w:tcPr>
+            <w:tcW w:type="dxa" w:w="2657"/>
+          </w:tcPr>
+          <w:p>
+            <w:pPr>
+              <w:spacing w:after="20" w:line="240" w:lineRule="auto"/>
+            </w:pPr>
+            <w:r>
+              <w:rPr>
+                <w:sz w:val="17"/>
+              </w:rPr>
+              <w:t>Pico · Día 3</w:t>
+            </w:r>
+          </w:p>
+        </w:tc>
+        <w:tc>
+          <w:tcPr>
+            <w:tcW w:type="dxa" w:w="1162"/>
+          </w:tcPr>
+          <w:p>
+            <w:pPr>
+              <w:spacing w:after="20" w:line="240" w:lineRule="auto"/>
+            </w:pPr>
+            <w:r>
+              <w:rPr>
+                <w:sz w:val="17"/>
+              </w:rPr>
+              <w:t>−0,02</w:t>
+            </w:r>
+          </w:p>
+        </w:tc>
+        <w:tc>
+          <w:tcPr>
+            <w:tcW w:type="dxa" w:w="1162"/>
+          </w:tcPr>
+          <w:p>
+            <w:pPr>
+              <w:spacing w:after="20" w:line="240" w:lineRule="auto"/>
+            </w:pPr>
+            <w:r>
+              <w:rPr>
+                <w:sz w:val="17"/>
+              </w:rPr>
+              <w:t>0,01</w:t>
+            </w:r>
+          </w:p>
+        </w:tc>
+        <w:tc>
+          <w:tcPr>
+            <w:tcW w:type="dxa" w:w="1162"/>
+          </w:tcPr>
+          <w:p>
+            <w:pPr>
+              <w:spacing w:after="20" w:line="240" w:lineRule="auto"/>
+            </w:pPr>
+            <w:r>
+              <w:rPr>
+                <w:sz w:val="17"/>
+              </w:rPr>
+              <w:t>−0,04</w:t>
+            </w:r>
+          </w:p>
+        </w:tc>
+        <w:tc>
+          <w:tcPr>
+            <w:tcW w:type="dxa" w:w="1162"/>
+          </w:tcPr>
+          <w:p>
+            <w:pPr>
+              <w:spacing w:after="20" w:line="240" w:lineRule="auto"/>
+            </w:pPr>
+            <w:r>
+              <w:rPr>
+                <w:sz w:val="17"/>
+              </w:rPr>
+              <w:t>0,10*</w:t>
+            </w:r>
+          </w:p>
+        </w:tc>
+        <w:tc>
+          <w:tcPr>
+            <w:tcW w:type="dxa" w:w="1162"/>
+          </w:tcPr>
+          <w:p>
+            <w:pPr>
+              <w:spacing w:after="20" w:line="240" w:lineRule="auto"/>
+            </w:pPr>
+            <w:r>
+              <w:rPr>
+                <w:sz w:val="17"/>
+              </w:rPr>
+              <w:t>0,18*</w:t>
+            </w:r>
+          </w:p>
+        </w:tc>
+        <w:tc>
+          <w:tcPr>
+            <w:tcW w:type="dxa" w:w="1162"/>
+          </w:tcPr>
+          <w:p>
+            <w:pPr>
+              <w:spacing w:after="20" w:line="240" w:lineRule="auto"/>
+            </w:pPr>
+            <w:r>
+              <w:rPr>
+                <w:sz w:val="17"/>
+              </w:rPr>
+              <w:t>0,25*</w:t>
+            </w:r>
+          </w:p>
+        </w:tc>
+      </w:tr>
+      <w:tr>
+        <w:tc>
+          <w:tcPr>
+            <w:tcW w:type="dxa" w:w="2657"/>
+            <w:shd w:val="clear" w:color="auto" w:fill="F3F6FA"/>
+          </w:tcPr>
+          <w:p>
+            <w:pPr>
+              <w:spacing w:after="20" w:line="240" w:lineRule="auto"/>
+            </w:pPr>
+            <w:r>
+              <w:rPr>
+                <w:sz w:val="17"/>
+              </w:rPr>
+              <w:t>Desplome · Día 1</w:t>
+            </w:r>
+          </w:p>
+        </w:tc>
+        <w:tc>
+          <w:tcPr>
+            <w:tcW w:type="dxa" w:w="1162"/>
+            <w:shd w:val="clear" w:color="auto" w:fill="F3F6FA"/>
+          </w:tcPr>
+          <w:p>
+            <w:pPr>
+              <w:spacing w:after="20" w:line="240" w:lineRule="auto"/>
+            </w:pPr>
+            <w:r>
+              <w:rPr>
+                <w:sz w:val="17"/>
+              </w:rPr>
+              <w:t>0,46*</w:t>
+            </w:r>
+          </w:p>
+        </w:tc>
+        <w:tc>
+          <w:tcPr>
+            <w:tcW w:type="dxa" w:w="1162"/>
+            <w:shd w:val="clear" w:color="auto" w:fill="F3F6FA"/>
+          </w:tcPr>
+          <w:p>
+            <w:pPr>
+              <w:spacing w:after="20" w:line="240" w:lineRule="auto"/>
+            </w:pPr>
+            <w:r>
+              <w:rPr>
+                <w:sz w:val="17"/>
+              </w:rPr>
+              <w:t>0,57*</w:t>
+            </w:r>
+          </w:p>
+        </w:tc>
+        <w:tc>
+          <w:tcPr>
+            <w:tcW w:type="dxa" w:w="1162"/>
+            <w:shd w:val="clear" w:color="auto" w:fill="F3F6FA"/>
+          </w:tcPr>
+          <w:p>
+            <w:pPr>
+              <w:spacing w:after="20" w:line="240" w:lineRule="auto"/>
+            </w:pPr>
+            <w:r>
+              <w:rPr>
+                <w:sz w:val="17"/>
+              </w:rPr>
+              <w:t>0,42*</w:t>
+            </w:r>
+          </w:p>
+        </w:tc>
+        <w:tc>
+          <w:tcPr>
+            <w:tcW w:type="dxa" w:w="1162"/>
+            <w:shd w:val="clear" w:color="auto" w:fill="F3F6FA"/>
+          </w:tcPr>
+          <w:p>
+            <w:pPr>
+              <w:spacing w:after="20" w:line="240" w:lineRule="auto"/>
+            </w:pPr>
+            <w:r>
+              <w:rPr>
+                <w:sz w:val="17"/>
+              </w:rPr>
+              <w:t>0,33*</w:t>
+            </w:r>
+          </w:p>
+        </w:tc>
+        <w:tc>
+          <w:tcPr>
+            <w:tcW w:type="dxa" w:w="1162"/>
+            <w:shd w:val="clear" w:color="auto" w:fill="F3F6FA"/>
+          </w:tcPr>
+          <w:p>
+            <w:pPr>
+              <w:spacing w:after="20" w:line="240" w:lineRule="auto"/>
+            </w:pPr>
+            <w:r>
+              <w:rPr>
+                <w:sz w:val="17"/>
+              </w:rPr>
+              <w:t>0,31*</w:t>
+            </w:r>
+          </w:p>
+        </w:tc>
+        <w:tc>
+          <w:tcPr>
+            <w:tcW w:type="dxa" w:w="1162"/>
+            <w:shd w:val="clear" w:color="auto" w:fill="F3F6FA"/>
+          </w:tcPr>
+          <w:p>
+            <w:pPr>
+              <w:spacing w:after="20" w:line="240" w:lineRule="auto"/>
+            </w:pPr>
+            <w:r>
+              <w:rPr>
+                <w:sz w:val="17"/>
+              </w:rPr>
+              <w:t>0,34*</w:t>
+            </w:r>
+          </w:p>
+        </w:tc>
+      </w:tr>
+      <w:tr>
+        <w:tc>
+          <w:tcPr>
+            <w:tcW w:type="dxa" w:w="2657"/>
+          </w:tcPr>
+          <w:p>
+            <w:pPr>
+              <w:spacing w:after="20" w:line="240" w:lineRule="auto"/>
+            </w:pPr>
+            <w:r>
+              <w:rPr>
+                <w:sz w:val="17"/>
+              </w:rPr>
+              <w:t>Desplome · Día 2</w:t>
+            </w:r>
+          </w:p>
+        </w:tc>
+        <w:tc>
+          <w:tcPr>
+            <w:tcW w:type="dxa" w:w="1162"/>
+          </w:tcPr>
+          <w:p>
+            <w:pPr>
+              <w:spacing w:after="20" w:line="240" w:lineRule="auto"/>
+            </w:pPr>
+            <w:r>
+              <w:rPr>
+                <w:sz w:val="17"/>
+              </w:rPr>
+              <w:t>−0,08</w:t>
+            </w:r>
+          </w:p>
+        </w:tc>
+        <w:tc>
+          <w:tcPr>
+            <w:tcW w:type="dxa" w:w="1162"/>
+          </w:tcPr>
+          <w:p>
+            <w:pPr>
+              <w:spacing w:after="20" w:line="240" w:lineRule="auto"/>
+            </w:pPr>
+            <w:r>
+              <w:rPr>
+                <w:sz w:val="17"/>
+              </w:rPr>
+              <w:t>0,31*</w:t>
+            </w:r>
+          </w:p>
+        </w:tc>
+        <w:tc>
+          <w:tcPr>
+            <w:tcW w:type="dxa" w:w="1162"/>
+          </w:tcPr>
+          <w:p>
+            <w:pPr>
+              <w:spacing w:after="20" w:line="240" w:lineRule="auto"/>
+            </w:pPr>
+            <w:r>
+              <w:rPr>
+                <w:sz w:val="17"/>
+              </w:rPr>
+              <w:t>0,07</w:t>
+            </w:r>
+          </w:p>
+        </w:tc>
+        <w:tc>
+          <w:tcPr>
+            <w:tcW w:type="dxa" w:w="1162"/>
+          </w:tcPr>
+          <w:p>
+            <w:pPr>
+              <w:spacing w:after="20" w:line="240" w:lineRule="auto"/>
+            </w:pPr>
+            <w:r>
+              <w:rPr>
+                <w:sz w:val="17"/>
+              </w:rPr>
+              <w:t>−0,01</w:t>
+            </w:r>
+          </w:p>
+        </w:tc>
+        <w:tc>
+          <w:tcPr>
+            <w:tcW w:type="dxa" w:w="1162"/>
+          </w:tcPr>
+          <w:p>
+            <w:pPr>
+              <w:spacing w:after="20" w:line="240" w:lineRule="auto"/>
+            </w:pPr>
+            <w:r>
+              <w:rPr>
+                <w:sz w:val="17"/>
+              </w:rPr>
+              <w:t>0,07</w:t>
+            </w:r>
+          </w:p>
+        </w:tc>
+        <w:tc>
+          <w:tcPr>
+            <w:tcW w:type="dxa" w:w="1162"/>
+          </w:tcPr>
+          <w:p>
+            <w:pPr>
+              <w:spacing w:after="20" w:line="240" w:lineRule="auto"/>
+            </w:pPr>
+            <w:r>
+              <w:rPr>
+                <w:sz w:val="17"/>
+              </w:rPr>
+              <w:t>0,13*</w:t>
+            </w:r>
+          </w:p>
+        </w:tc>
+      </w:tr>
+      <w:tr>
+        <w:tc>
+          <w:tcPr>
+            <w:tcW w:type="dxa" w:w="2657"/>
+            <w:shd w:val="clear" w:color="auto" w:fill="F3F6FA"/>
+          </w:tcPr>
+          <w:p>
+            <w:pPr>
+              <w:spacing w:after="20" w:line="240" w:lineRule="auto"/>
+            </w:pPr>
+            <w:r>
+              <w:rPr>
+                <w:sz w:val="17"/>
+              </w:rPr>
+              <w:t>Desplome · Día 3</w:t>
+            </w:r>
+          </w:p>
+        </w:tc>
+        <w:tc>
+          <w:tcPr>
+            <w:tcW w:type="dxa" w:w="1162"/>
+            <w:shd w:val="clear" w:color="auto" w:fill="F3F6FA"/>
+          </w:tcPr>
+          <w:p>
+            <w:pPr>
+              <w:spacing w:after="20" w:line="240" w:lineRule="auto"/>
+            </w:pPr>
+            <w:r>
+              <w:rPr>
+                <w:sz w:val="17"/>
+              </w:rPr>
+              <w:t>−0,30†</w:t>
+            </w:r>
+          </w:p>
+        </w:tc>
+        <w:tc>
+          <w:tcPr>
+            <w:tcW w:type="dxa" w:w="1162"/>
+            <w:shd w:val="clear" w:color="auto" w:fill="F3F6FA"/>
+          </w:tcPr>
+          <w:p>
+            <w:pPr>
+              <w:spacing w:after="20" w:line="240" w:lineRule="auto"/>
+            </w:pPr>
+            <w:r>
+              <w:rPr>
+                <w:sz w:val="17"/>
+              </w:rPr>
+              <w:t>0,25*</w:t>
+            </w:r>
+          </w:p>
+        </w:tc>
+        <w:tc>
+          <w:tcPr>
+            <w:tcW w:type="dxa" w:w="1162"/>
+            <w:shd w:val="clear" w:color="auto" w:fill="F3F6FA"/>
+          </w:tcPr>
+          <w:p>
+            <w:pPr>
+              <w:spacing w:after="20" w:line="240" w:lineRule="auto"/>
+            </w:pPr>
+            <w:r>
+              <w:rPr>
+                <w:sz w:val="17"/>
+              </w:rPr>
+              <w:t>−0,04</w:t>
+            </w:r>
+          </w:p>
+        </w:tc>
+        <w:tc>
+          <w:tcPr>
+            <w:tcW w:type="dxa" w:w="1162"/>
+            <w:shd w:val="clear" w:color="auto" w:fill="F3F6FA"/>
+          </w:tcPr>
+          <w:p>
+            <w:pPr>
+              <w:spacing w:after="20" w:line="240" w:lineRule="auto"/>
+            </w:pPr>
+            <w:r>
+              <w:rPr>
+                <w:sz w:val="17"/>
+              </w:rPr>
+              <w:t>−0,03</w:t>
+            </w:r>
+          </w:p>
+        </w:tc>
+        <w:tc>
+          <w:tcPr>
+            <w:tcW w:type="dxa" w:w="1162"/>
+            <w:shd w:val="clear" w:color="auto" w:fill="F3F6FA"/>
+          </w:tcPr>
+          <w:p>
+            <w:pPr>
+              <w:spacing w:after="20" w:line="240" w:lineRule="auto"/>
+            </w:pPr>
+            <w:r>
+              <w:rPr>
+                <w:sz w:val="17"/>
+              </w:rPr>
+              <w:t>0,05</w:t>
+            </w:r>
+          </w:p>
+        </w:tc>
+        <w:tc>
+          <w:tcPr>
+            <w:tcW w:type="dxa" w:w="1162"/>
+            <w:shd w:val="clear" w:color="auto" w:fill="F3F6FA"/>
+          </w:tcPr>
+          <w:p>
+            <w:pPr>
+              <w:spacing w:after="20" w:line="240" w:lineRule="auto"/>
+            </w:pPr>
+            <w:r>
+              <w:rPr>
+                <w:sz w:val="17"/>
+              </w:rPr>
+              <w:t>0,11*</w:t>
+            </w:r>
+          </w:p>
+        </w:tc>
+      </w:tr>
+    </w:tbl>
+    <w:p>
+      <w:r>
+        <w:rPr>
+          <w:color w:val="595959"/>
+          <w:sz w:val="17"/>
+        </w:rPr>
+        <w:t>BSS positivo = mejor que la frecuencia histórica de esa hora. * = significativamente mejor; † = significativamente peor (Diebold-Mariano sobre el puntaje de Brier, p &lt; 0,05). Se publican el día 1 (pico y desplome) y el pico de los días 2 y 3.</w:t>
+      </w:r>
+    </w:p>
+    <w:p>
+      <w:pPr>
         <w:pStyle w:val="Heading1"/>
       </w:pPr>
       <w:r>
@@ -11817,7 +15144,7 @@
           <w:color w:val="1F4E79"/>
           <w:sz w:val="20"/>
         </w:rPr>
-        <w:t>Tabla 21. Antecedentes y comparación</w:t>
+        <w:t>Tabla 24. Antecedentes y comparación</w:t>
       </w:r>
     </w:p>
     <w:tbl>
@@ -12524,7 +15851,7 @@
         <w:t>Operador</w:t>
       </w:r>
       <w:r>
-        <w:t xml:space="preserve"> (recomendación de la hora elegida, pronóstico del día con banda, horas para actuar y alertas de pico o desplome), </w:t>
+        <w:t xml:space="preserve"> (recomendación de la hora elegida, pronóstico del día con banda, horas para actuar y posibilidad de pico o desplome), </w:t>
       </w:r>
       <w:r>
         <w:rPr>
@@ -12647,7 +15974,7 @@
         <w:t>Cambios regulatorios.</w:t>
       </w:r>
       <w:r>
-        <w:t xml:space="preserve"> La Resolución CREG 101 127 de 2026 cambió las reglas dentro del periodo de operación; un modelo entrenado con el pasado necesita tiempo o variables nuevas para adaptarse.</w:t>
+        <w:t xml:space="preserve"> La Resolución CREG 101 127 de 2026 cambió las reglas dentro del periodo de operación y duplicó el error de todos los pronósticos, incluido el del predespacho de XM. Las dos adaptaciones probadas (más peso a lo reciente y una aproximación de la curva de ofertas de la resolución) no pasaron la validación histórica.</w:t>
       </w:r>
     </w:p>
     <w:p>
@@ -12697,6 +16024,21 @@
     </w:p>
     <w:p>
       <w:pPr>
+        <w:pStyle w:val="ListBullet"/>
+        <w:spacing w:after="60"/>
+      </w:pPr>
+      <w:r>
+        <w:rPr>
+          <w:b/>
+        </w:rPr>
+        <w:t>Picos y desplomes a 2 y 3 días.</w:t>
+      </w:r>
+      <w:r>
+        <w:t xml:space="preserve"> Solo el detector de pico supera a la climatología en esos días, y no en todos los años; el de desplome no se publica.</w:t>
+      </w:r>
+    </w:p>
+    <w:p>
+      <w:pPr>
         <w:pStyle w:val="Heading1"/>
       </w:pPr>
       <w:r>
@@ -12714,7 +16056,7 @@
           <w:color w:val="1F4E79"/>
           <w:sz w:val="20"/>
         </w:rPr>
-        <w:t>Tabla 22. Términos usados en el documento</w:t>
+        <w:t>Tabla 25. Términos usados en el documento</w:t>
       </w:r>
     </w:p>
     <w:tbl>

</xml_diff>

<commit_message>
Informe final y documento de funcionamiento: ventana 2019-2026 justificada (CREG 178/2015 y 140/2017), citas sin uso corregidas, dashboard y figuras del 23-oct
Co-Authored-By: Claude Opus 5.5 <noreply@anthropic.com>
</commit_message>
<xml_diff>
--- a/docs/Funcionamiento_Augur.docx
+++ b/docs/Funcionamiento_Augur.docx
@@ -2017,6 +2017,20 @@
       </w:pPr>
       <w:r>
         <w:t>Series del proyecto: un dataset maestro horario sincronizado de enero de 2019 a agosto de 2026 (66.576 horas) y una serie de operación que se actualiza todos los días con lo nuevo de XM y NOAA. El año 2026 se reservó como prueba fuera de muestra; 2019-2025 sirve para entrenar y para la validación histórica.</w:t>
+      </w:r>
+    </w:p>
+    <w:p>
+      <w:pPr>
+        <w:jc w:val="both"/>
+      </w:pPr>
+      <w:r>
+        <w:rPr>
+          <w:b/>
+        </w:rPr>
+        <w:t>Por qué desde 2019.</w:t>
+      </w:r>
+      <w:r>
+        <w:t xml:space="preserve"> Durante El Niño 2015-2016 el mercado operó con medidas transitorias de escasez (Resolución CREG 178 de 2015, con un piso al precio de escasez), y desde el 1 de diciembre de 2017 rige el precio marginal de escasez (Resolución CREG 140 de 2017), que cambió la regla que activa la condición crítica y pone techo al precio que paga la demanda. Empezar en 2019 deja un año completo con la regla vigente. Los datos lo confirman: 2017 y 2018 forman un régimen de precios más bajo (medias de 106 y 116 COP/kWh, frente a 228 o más desde 2019), y entrenar desde 2017 no mejoró ningún modelo.</w:t>
       </w:r>
     </w:p>
     <w:p>
@@ -15851,7 +15865,7 @@
         <w:t>Operador</w:t>
       </w:r>
       <w:r>
-        <w:t xml:space="preserve"> (recomendación de la hora elegida, pronóstico del día con banda, horas para actuar y posibilidad de pico o desplome), </w:t>
+        <w:t xml:space="preserve"> (recomendación de la hora elegida, pronóstico del día con banda, posibilidad de pico o desplome, franja de las 24 horas, mapa de calor de los últimos tres días, indicadores y la semana alrededor del día), </w:t>
       </w:r>
       <w:r>
         <w:rPr>
@@ -15860,7 +15874,7 @@
         <w:t>Analista</w:t>
       </w:r>
       <w:r>
-        <w:t xml:space="preserve"> (semana, mapa de calor, backtest del motor y comparación de métodos) y </w:t>
+        <w:t xml:space="preserve"> (backtest del motor, comparación de métodos y datos filtrados) y </w:t>
       </w:r>
       <w:r>
         <w:rPr>
@@ -15869,7 +15883,7 @@
         <w:t>Metodología</w:t>
       </w:r>
       <w:r>
-        <w:t xml:space="preserve"> (cómo funciona, fórmulas y validación). Las gráficas admiten zoom con Ctrl + rueda o el touchpad, desplazamiento, clic en una hora para analizarla y botón para centrar.</w:t>
+        <w:t xml:space="preserve"> (desempeño en vivo, cómo funciona, fórmulas y validación). Las gráficas admiten zoom con Ctrl + rueda o el touchpad, desplazamiento, clic en una hora para analizarla y botón para centrar. Cada gráfica y la franja se exportan en JPG o PDF, y la vista Operador genera un reporte del día y un reporte completo en PDF.</w:t>
       </w:r>
     </w:p>
     <w:p>
@@ -15880,7 +15894,7 @@
       <w:r>
         <w:drawing>
           <wp:inline xmlns:a="http://schemas.openxmlformats.org/drawingml/2006/main" xmlns:pic="http://schemas.openxmlformats.org/drawingml/2006/picture">
-            <wp:extent cx="5400000" cy="3042500"/>
+            <wp:extent cx="5400000" cy="3205000"/>
             <wp:docPr id="4" name="Picture 4"/>
             <wp:cNvGraphicFramePr>
               <a:graphicFrameLocks noChangeAspect="1"/>
@@ -15901,7 +15915,7 @@
                   <pic:spPr>
                     <a:xfrm>
                       <a:off x="0" y="0"/>
-                      <a:ext cx="5400000" cy="3042500"/>
+                      <a:ext cx="5400000" cy="3205000"/>
                     </a:xfrm>
                     <a:prstGeom prst="rect"/>
                   </pic:spPr>

</xml_diff>